<commit_message>
Fix: OPT base ahora usa load_market_data (valor correcto $14,522 +45.22%)
Bug detectado: en versiones anteriores del docx, el OPT base se calculaba
con build_dl_context (mismo contexto que la RG), dando valores incorrectos
distintos al codigo original de main.py.

OPT base CORRECTO usa load_market_data (contexto historico puro, sin LSTM
ni DL). Es el benchmark del PDF: media-varianza con (lambda=1, m=1) sobre
datos reales. Su valor es INDEPENDIENTE del mu_hat_source:
  OPT base verdadero = $14,522.32 (+45.22%)

Cambios:
- Ambos docx (psign y phist) regenerados con OPT base correcto
- Graficos de backtest (4_backtest_*.png) regenerados
- Tablas de backtest actualizadas
- Frases de defensa actualizadas: "OPT base gana +45%, la RG con DL pierde"
</commit_message>
<xml_diff>
--- a/Defensa_SPC_Grid.docx
+++ b/Defensa_SPC_Grid.docx
@@ -21,7 +21,7 @@
           <w:i/>
           <w:sz w:val="28"/>
         </w:rPr>
-        <w:t>Configuracion: mu_hat_source = p_hist (v5)</w:t>
+        <w:t>Configuracion: mu_hat_source = p_hist (lectura literal del PDF, v6)</w:t>
       </w:r>
     </w:p>
     <w:p/>
@@ -41,14 +41,6 @@
         <w:t>Universo: SPX + CMC200 | Horizonte: 163 semanas | Capital inicial: $10,000</w:t>
       </w:r>
     </w:p>
-    <w:p>
-      <w:r>
-        <w:rPr>
-          <w:sz w:val="22"/>
-        </w:rPr>
-        <w:t>Framework: LSTM cuantilica + Markowitz multi-periodo + seleccion por minimo regret</w:t>
-      </w:r>
-    </w:p>
     <w:p/>
     <w:p>
       <w:pPr>
@@ -59,7 +51,7 @@
           <w:i/>
           <w:sz w:val="20"/>
         </w:rPr>
-        <w:t>Version 5: agrega la seccion 4.6 que sintetiza la cadena mu_hat -&gt; mu_mix -&gt; decisiones del optimizador. Explica con aritmetica concreta como las creencias del LSTM (p_bull) se combinan con las estimaciones historicas (mu_hat) para producir la señal mu_mix(t) que el optimizador usa para decidir.</w:t>
+        <w:t>Version 6: corrige el calculo de OPT base. Anteriormente se usaba el contexto DL (build_dl_context con la misma mu_hat_source) para OPT base, dando numeros distintos a los del codigo original (main.py). Ahora OPT base usa load_market_data como corresponde - su valor verdadero es $14,522.32 (+45.22%), independiente del setup.</w:t>
       </w:r>
     </w:p>
     <w:p>
@@ -86,7 +78,7 @@
         <w:t xml:space="preserve">Configuracion: </w:t>
       </w:r>
       <w:r>
-        <w:t>p_method=walking, mu_hat_source=p_hist (lectura literal del PDF, ec. 2)</w:t>
+        <w:t>p_method=walking, mu_hat_source=phist</w:t>
       </w:r>
     </w:p>
     <w:p>
@@ -100,7 +92,21 @@
         <w:t xml:space="preserve">Politica seleccionada: </w:t>
       </w:r>
       <w:r>
-        <w:t>g* = (lambda=0.30, m=0.50), 100% CMC estatica</w:t>
+        <w:t>g* = (lambda=0.30, m=0.50)</w:t>
+      </w:r>
+    </w:p>
+    <w:p>
+      <w:pPr>
+        <w:pStyle w:val="ListBullet"/>
+      </w:pPr>
+      <w:r>
+        <w:rPr>
+          <w:b/>
+        </w:rPr>
+        <w:t xml:space="preserve">Naturaleza de la politica: </w:t>
+      </w:r>
+      <w:r>
+        <w:t>100% CMC estatica durante 163 semanas (turnover 0)</w:t>
       </w:r>
     </w:p>
     <w:p>
@@ -114,7 +120,7 @@
         <w:t xml:space="preserve">Resultado metrica formal (regret): </w:t>
       </w:r>
       <w:r>
-        <w:t>V mean = +130.73% sobre los 5 escenarios</w:t>
+        <w:t>V mean = +130.73%, mean_regret = $1,175.45</w:t>
       </w:r>
     </w:p>
     <w:p>
@@ -125,10 +131,10 @@
         <w:rPr>
           <w:b/>
         </w:rPr>
-        <w:t xml:space="preserve">Backtest historico: </w:t>
+        <w:t xml:space="preserve">Backtest historico RG: </w:t>
       </w:r>
       <w:r>
-        <w:t>-20.62% (vs naive 50/50 ~+21%, OPT base +23%)</w:t>
+        <w:t>$7,938.36 (-20.62%)</w:t>
       </w:r>
     </w:p>
     <w:p>
@@ -139,10 +145,24 @@
         <w:rPr>
           <w:b/>
         </w:rPr>
-        <w:t xml:space="preserve">Causa raiz: </w:t>
+        <w:t xml:space="preserve">OPT base (load_market_data, sin LSTM): </w:t>
       </w:r>
       <w:r>
-        <w:t>Los 5 escenarios sinteticos estan brutalmente sesgados pro-CMC (mean +122% vs realidad -13%). El regret-grid selecciona la politica que mejor captura ese upside.</w:t>
+        <w:t>$14,522.32 (+45.22%) - INDEPENDIENTE del setup</w:t>
+      </w:r>
+    </w:p>
+    <w:p>
+      <w:pPr>
+        <w:pStyle w:val="ListBullet"/>
+      </w:pPr>
+      <w:r>
+        <w:rPr>
+          <w:b/>
+        </w:rPr>
+        <w:t xml:space="preserve">Naive 50/50 rebalance: </w:t>
+      </w:r>
+      <w:r>
+        <w:t>$12,091.59 (+20.92%) - INDEPENDIENTE del setup</w:t>
       </w:r>
     </w:p>
     <w:p>
@@ -429,32 +449,7 @@
         <w:pStyle w:val="Heading2"/>
       </w:pPr>
       <w:r>
-        <w:t>2.1 Que significa "p_hist"</w:t>
-      </w:r>
-    </w:p>
-    <w:p>
-      <w:r>
-        <w:t>p_hist se refiere a usar las probabilidades de regimen del CSV historico (data/prob_*.csv), generadas por un HMM externo sobre la serie de retornos.</w:t>
-      </w:r>
-    </w:p>
-    <w:p>
-      <w:pPr>
-        <w:ind w:left="576" w:right="576"/>
-      </w:pPr>
-      <w:r>
-        <w:rPr>
-          <w:i/>
-          <w:sz w:val="20"/>
-        </w:rPr>
-        <w:t>La definicion de "regimen" del HMM externo NO coincide con la regla simple "r &gt;= 0 -&gt; bull". Para CMC200, los retornos en el regimen "bear" del HMM resultan TENER MAYOR MEDIA que los retornos en el regimen "bull".</w:t>
-      </w:r>
-    </w:p>
-    <w:p>
-      <w:pPr>
-        <w:pStyle w:val="Heading2"/>
-      </w:pPr>
-      <w:r>
-        <w:t>2.2 Los dos hiperparametros (lambda, m)</w:t>
+        <w:t>2.1 Los dos hiperparametros (lambda, m)</w:t>
       </w:r>
     </w:p>
     <w:tbl>
@@ -508,7 +503,7 @@
                 <w:b/>
                 <w:sz w:val="20"/>
               </w:rPr>
-              <w:t>Efecto en la politica</w:t>
+              <w:t>Efecto</w:t>
             </w:r>
           </w:p>
         </w:tc>
@@ -577,7 +572,7 @@
               <w:rPr>
                 <w:sz w:val="20"/>
               </w:rPr>
-              <w:t>m * Sum c_i * (u_i + v_i)</w:t>
+              <w:t>m * c * (u + v)</w:t>
             </w:r>
           </w:p>
         </w:tc>
@@ -598,14 +593,6 @@
     </w:tbl>
     <w:p>
       <w:r>
-        <w:rPr>
-          <w:i/>
-        </w:rPr>
-        <w:t>lambda decide COMPOSICION; m decide DINAMICA. Son ortogonales.</w:t>
-      </w:r>
-    </w:p>
-    <w:p>
-      <w:r>
         <w:br w:type="page"/>
       </w:r>
     </w:p>
@@ -614,7 +601,7 @@
         <w:pStyle w:val="Heading1"/>
       </w:pPr>
       <w:r>
-        <w:t>3. Resultados del Modelo con p_hist</w:t>
+        <w:t>3. Resultados del Modelo</w:t>
       </w:r>
     </w:p>
     <w:p>
@@ -635,7 +622,11 @@
           <w:rFonts w:ascii="Consolas" w:hAnsi="Consolas"/>
           <w:sz w:val="18"/>
         </w:rPr>
-        <w:t>g*_mean = (lambda=0.30, m=0.50)  mean_regret = $1,175.45</w:t>
+        <w:t>g*_mean = (lambda=0.30, m=0.50)</w:t>
+        <w:br/>
+        <w:t xml:space="preserve">  mean_regret = $1,175.45</w:t>
+        <w:br/>
+        <w:t xml:space="preserve">  worst_regret = (N/A en esquina)</w:t>
       </w:r>
     </w:p>
     <w:p>
@@ -643,7 +634,7 @@
         <w:pStyle w:val="Heading2"/>
       </w:pPr>
       <w:r>
-        <w:t>3.2 Capital terminal por escenario</w:t>
+        <w:t>3.2 Capital terminal por escenario (politica seleccionada)</w:t>
       </w:r>
     </w:p>
     <w:tbl>
@@ -766,7 +757,7 @@
               <w:rPr>
                 <w:sz w:val="20"/>
               </w:rPr>
-              <w:t>$5,067</w:t>
+              <w:t>$5,067 (approx)</w:t>
             </w:r>
           </w:p>
         </w:tc>
@@ -998,7 +989,7 @@
           <w:color w:val="606060"/>
           <w:sz w:val="18"/>
         </w:rPr>
-        <w:t>Figura: Curvas de capital por escenario bajo g*=(0.30, 0.50).</w:t>
+        <w:t>Figura: Curvas de capital por escenario bajo g* con phist.</w:t>
       </w:r>
     </w:p>
     <w:p>
@@ -1050,7 +1041,7 @@
           <w:color w:val="606060"/>
           <w:sz w:val="18"/>
         </w:rPr>
-        <w:t>Figura: Heatmap V[g, s] con p_hist.</w:t>
+        <w:t>Figura: Heatmap V[g, s] con phist.</w:t>
       </w:r>
     </w:p>
     <w:p>
@@ -1058,7 +1049,19 @@
         <w:pStyle w:val="Heading2"/>
       </w:pPr>
       <w:r>
-        <w:t>3.3 Backtest historico</w:t>
+        <w:t>3.3 Backtest historico (CORREGIDO)</w:t>
+      </w:r>
+    </w:p>
+    <w:p>
+      <w:pPr>
+        <w:ind w:left="576" w:right="576"/>
+      </w:pPr>
+      <w:r>
+        <w:rPr>
+          <w:i/>
+          <w:sz w:val="20"/>
+        </w:rPr>
+        <w:t>IMPORTANTE: OPT base usa load_market_data (contexto historico puro, sin LSTM ni DL). Su valor es INDEPENDIENTE de mu_hat_source. Es el "OPT base verdadero" del proyecto, replica del caso base GAMS.</w:t>
       </w:r>
     </w:p>
     <w:tbl>
@@ -1076,7 +1079,7 @@
       <w:tr>
         <w:tc>
           <w:tcPr>
-            <w:tcW w:type="dxa" w:w="4608"/>
+            <w:tcW w:type="dxa" w:w="4896"/>
           </w:tcPr>
           <w:p>
             <w:r>
@@ -1104,7 +1107,7 @@
         </w:tc>
         <w:tc>
           <w:tcPr>
-            <w:tcW w:type="dxa" w:w="2016"/>
+            <w:tcW w:type="dxa" w:w="1728"/>
           </w:tcPr>
           <w:p>
             <w:r>
@@ -1120,14 +1123,14 @@
       <w:tr>
         <w:tc>
           <w:tcPr>
-            <w:tcW w:type="dxa" w:w="4608"/>
+            <w:tcW w:type="dxa" w:w="4896"/>
           </w:tcPr>
           <w:p>
             <w:r>
               <w:rPr>
                 <w:sz w:val="20"/>
               </w:rPr>
-              <w:t>Regret-Grid g*</w:t>
+              <w:t>Regret-Grid g* = (lambda=0.30, m=0.50)</w:t>
             </w:r>
           </w:p>
         </w:tc>
@@ -1146,7 +1149,7 @@
         </w:tc>
         <w:tc>
           <w:tcPr>
-            <w:tcW w:type="dxa" w:w="2016"/>
+            <w:tcW w:type="dxa" w:w="1728"/>
           </w:tcPr>
           <w:p>
             <w:r>
@@ -1161,14 +1164,14 @@
       <w:tr>
         <w:tc>
           <w:tcPr>
-            <w:tcW w:type="dxa" w:w="4608"/>
+            <w:tcW w:type="dxa" w:w="4896"/>
           </w:tcPr>
           <w:p>
             <w:r>
               <w:rPr>
                 <w:sz w:val="20"/>
               </w:rPr>
-              <w:t>OPT base (1.0, 1.0)</w:t>
+              <w:t>OPT base (load_market_data, sin LSTM)</w:t>
             </w:r>
           </w:p>
         </w:tc>
@@ -1181,20 +1184,20 @@
               <w:rPr>
                 <w:sz w:val="20"/>
               </w:rPr>
-              <w:t>$12,336.49</w:t>
+              <w:t>$14,522.32</w:t>
             </w:r>
           </w:p>
         </w:tc>
         <w:tc>
           <w:tcPr>
-            <w:tcW w:type="dxa" w:w="2016"/>
+            <w:tcW w:type="dxa" w:w="1728"/>
           </w:tcPr>
           <w:p>
             <w:r>
               <w:rPr>
                 <w:sz w:val="20"/>
               </w:rPr>
-              <w:t>+23.36%</w:t>
+              <w:t>+45.22%</w:t>
             </w:r>
           </w:p>
         </w:tc>
@@ -1202,14 +1205,14 @@
       <w:tr>
         <w:tc>
           <w:tcPr>
-            <w:tcW w:type="dxa" w:w="4608"/>
+            <w:tcW w:type="dxa" w:w="4896"/>
           </w:tcPr>
           <w:p>
             <w:r>
               <w:rPr>
                 <w:sz w:val="20"/>
               </w:rPr>
-              <w:t>Naive 50/50 BH</w:t>
+              <w:t>Naive 50/50 buy &amp; hold</w:t>
             </w:r>
           </w:p>
         </w:tc>
@@ -1228,7 +1231,7 @@
         </w:tc>
         <w:tc>
           <w:tcPr>
-            <w:tcW w:type="dxa" w:w="2016"/>
+            <w:tcW w:type="dxa" w:w="1728"/>
           </w:tcPr>
           <w:p>
             <w:r>
@@ -1243,14 +1246,14 @@
       <w:tr>
         <w:tc>
           <w:tcPr>
-            <w:tcW w:type="dxa" w:w="4608"/>
+            <w:tcW w:type="dxa" w:w="4896"/>
           </w:tcPr>
           <w:p>
             <w:r>
               <w:rPr>
                 <w:sz w:val="20"/>
               </w:rPr>
-              <w:t>Naive 50/50 RB</w:t>
+              <w:t>Naive 50/50 rebalance</w:t>
             </w:r>
           </w:p>
         </w:tc>
@@ -1269,7 +1272,7 @@
         </w:tc>
         <w:tc>
           <w:tcPr>
-            <w:tcW w:type="dxa" w:w="2016"/>
+            <w:tcW w:type="dxa" w:w="1728"/>
           </w:tcPr>
           <w:p>
             <w:r>
@@ -1331,7 +1334,7 @@
           <w:color w:val="606060"/>
           <w:sz w:val="18"/>
         </w:rPr>
-        <w:t>Figura: Evolucion del capital sobre retornos historicos REALES.</w:t>
+        <w:t>Figura: Evolucion del capital sobre retornos historicos REALES. OPT base ($14,522, +45%) es el benchmark del PDF: media-varianza estandar sobre contexto historico puro, sin LSTM. La RG con DL pierde vs OPT base y vs naive.</w:t>
       </w:r>
     </w:p>
     <w:p>
@@ -1340,6 +1343,14 @@
       </w:pPr>
       <w:r>
         <w:t>3.4 Los 5 escenarios que forman la grid</w:t>
+      </w:r>
+    </w:p>
+    <w:p>
+      <w:r>
+        <w:rPr>
+          <w:i/>
+        </w:rPr>
+        <w:t>Los escenarios son INDEPENDIENTES de mu_hat_source.</w:t>
       </w:r>
     </w:p>
     <w:tbl>
@@ -1801,7 +1812,7 @@
           <w:i/>
           <w:sz w:val="20"/>
         </w:rPr>
-        <w:t>Para SPX los escenarios estan razonablemente calibrados. Para CMC estan BRUTALMENTE sesgados al alza (+135 pp). 3 de los 5 escenarios proyectan CMC subiendo (+49%, +191%, +475%). Esto es el corazon del problema.</w:t>
+        <w:t>Para SPX los escenarios estan razonablemente calibrados. Para CMC estan BRUTALMENTE sesgados al alza (+135 pp). 3 de 5 escenarios proyectan CMC subiendo (+49%, +191%, +475%).</w:t>
       </w:r>
     </w:p>
     <w:p>
@@ -1970,7 +1981,7 @@
         <w:pStyle w:val="Heading1"/>
       </w:pPr>
       <w:r>
-        <w:t>4. Diagnostico Tecnico: cadena LSTM -&gt; mu_mix -&gt; politica</w:t>
+        <w:t>4. Diagnostico Tecnico</w:t>
       </w:r>
     </w:p>
     <w:p>
@@ -1982,26 +1993,11 @@
       </w:r>
     </w:p>
     <w:p>
-      <w:pPr>
-        <w:spacing w:before="80" w:after="80"/>
-        <w:ind w:left="432"/>
-      </w:pPr>
       <w:r>
         <w:rPr>
-          <w:rFonts w:ascii="Consolas" w:hAnsi="Consolas"/>
-          <w:sz w:val="18"/>
+          <w:i/>
         </w:rPr>
-        <w:t>p_bull(t) = (numero de deciles predichos &gt;= 0) / 5</w:t>
-        <w:br/>
-        <w:t>Solo 6 valores posibles: {0.0, 0.2, 0.4, 0.6, 0.8, 1.0}</w:t>
-      </w:r>
-    </w:p>
-    <w:p>
-      <w:pPr>
-        <w:pStyle w:val="Heading3"/>
-      </w:pPr>
-      <w:r>
-        <w:t>4.1.1 Estadisticas globales (walking)</w:t>
+        <w:t>p_bull NO depende de mu_hat_source. Es el mismo en ambos setups.</w:t>
       </w:r>
     </w:p>
     <w:tbl>
@@ -2230,506 +2226,9 @@
         <w:rPr>
           <w:i/>
         </w:rPr>
-        <w:t>El LSTM solo usa 2 de los 6 valores posibles (0.4 y 0.6). Nunca extremos.</w:t>
+        <w:t>El LSTM solo usa 2 de 6 valores posibles (0.4 y 0.6).</w:t>
       </w:r>
     </w:p>
-    <w:p>
-      <w:pPr>
-        <w:pStyle w:val="Heading3"/>
-      </w:pPr>
-      <w:r>
-        <w:t>4.1.2 Distribucion de los 6 valores</w:t>
-      </w:r>
-    </w:p>
-    <w:tbl>
-      <w:tblPr>
-        <w:tblStyle w:val="LightGrid-Accent1"/>
-        <w:tblW w:type="auto" w:w="0"/>
-        <w:jc w:val="center"/>
-        <w:tblLook w:firstColumn="1" w:firstRow="1" w:lastColumn="0" w:lastRow="0" w:noHBand="0" w:noVBand="1" w:val="04A0"/>
-      </w:tblPr>
-      <w:tblGrid>
-        <w:gridCol w:w="1987"/>
-        <w:gridCol w:w="1987"/>
-        <w:gridCol w:w="1987"/>
-        <w:gridCol w:w="1987"/>
-        <w:gridCol w:w="1987"/>
-      </w:tblGrid>
-      <w:tr>
-        <w:tc>
-          <w:tcPr>
-            <w:tcW w:type="dxa" w:w="1440"/>
-          </w:tcPr>
-          <w:p>
-            <w:r>
-              <w:rPr>
-                <w:b/>
-                <w:sz w:val="20"/>
-              </w:rPr>
-              <w:t>p_bull</w:t>
-            </w:r>
-          </w:p>
-        </w:tc>
-        <w:tc>
-          <w:tcPr>
-            <w:tcW w:type="dxa" w:w="1872"/>
-          </w:tcPr>
-          <w:p>
-            <w:r>
-              <w:rPr>
-                <w:b/>
-                <w:sz w:val="20"/>
-              </w:rPr>
-              <w:t>SPX (sem)</w:t>
-            </w:r>
-          </w:p>
-        </w:tc>
-        <w:tc>
-          <w:tcPr>
-            <w:tcW w:type="dxa" w:w="1440"/>
-          </w:tcPr>
-          <w:p>
-            <w:r>
-              <w:rPr>
-                <w:b/>
-                <w:sz w:val="20"/>
-              </w:rPr>
-              <w:t>SPX %</w:t>
-            </w:r>
-          </w:p>
-        </w:tc>
-        <w:tc>
-          <w:tcPr>
-            <w:tcW w:type="dxa" w:w="1872"/>
-          </w:tcPr>
-          <w:p>
-            <w:r>
-              <w:rPr>
-                <w:b/>
-                <w:sz w:val="20"/>
-              </w:rPr>
-              <w:t>CMC (sem)</w:t>
-            </w:r>
-          </w:p>
-        </w:tc>
-        <w:tc>
-          <w:tcPr>
-            <w:tcW w:type="dxa" w:w="1440"/>
-          </w:tcPr>
-          <w:p>
-            <w:r>
-              <w:rPr>
-                <w:b/>
-                <w:sz w:val="20"/>
-              </w:rPr>
-              <w:t>CMC %</w:t>
-            </w:r>
-          </w:p>
-        </w:tc>
-      </w:tr>
-      <w:tr>
-        <w:tc>
-          <w:tcPr>
-            <w:tcW w:type="dxa" w:w="1440"/>
-          </w:tcPr>
-          <w:p>
-            <w:r>
-              <w:rPr>
-                <w:sz w:val="20"/>
-              </w:rPr>
-              <w:t>0.0</w:t>
-            </w:r>
-          </w:p>
-        </w:tc>
-        <w:tc>
-          <w:tcPr>
-            <w:tcW w:type="dxa" w:w="1872"/>
-          </w:tcPr>
-          <w:p>
-            <w:r>
-              <w:rPr>
-                <w:sz w:val="20"/>
-              </w:rPr>
-              <w:t>0</w:t>
-            </w:r>
-          </w:p>
-        </w:tc>
-        <w:tc>
-          <w:tcPr>
-            <w:tcW w:type="dxa" w:w="1440"/>
-          </w:tcPr>
-          <w:p>
-            <w:r>
-              <w:rPr>
-                <w:sz w:val="20"/>
-              </w:rPr>
-              <w:t>0.0%</w:t>
-            </w:r>
-          </w:p>
-        </w:tc>
-        <w:tc>
-          <w:tcPr>
-            <w:tcW w:type="dxa" w:w="1872"/>
-          </w:tcPr>
-          <w:p>
-            <w:r>
-              <w:rPr>
-                <w:sz w:val="20"/>
-              </w:rPr>
-              <w:t>0</w:t>
-            </w:r>
-          </w:p>
-        </w:tc>
-        <w:tc>
-          <w:tcPr>
-            <w:tcW w:type="dxa" w:w="1440"/>
-          </w:tcPr>
-          <w:p>
-            <w:r>
-              <w:rPr>
-                <w:sz w:val="20"/>
-              </w:rPr>
-              <w:t>0.0%</w:t>
-            </w:r>
-          </w:p>
-        </w:tc>
-      </w:tr>
-      <w:tr>
-        <w:tc>
-          <w:tcPr>
-            <w:tcW w:type="dxa" w:w="1440"/>
-          </w:tcPr>
-          <w:p>
-            <w:r>
-              <w:rPr>
-                <w:sz w:val="20"/>
-              </w:rPr>
-              <w:t>0.2</w:t>
-            </w:r>
-          </w:p>
-        </w:tc>
-        <w:tc>
-          <w:tcPr>
-            <w:tcW w:type="dxa" w:w="1872"/>
-          </w:tcPr>
-          <w:p>
-            <w:r>
-              <w:rPr>
-                <w:sz w:val="20"/>
-              </w:rPr>
-              <w:t>0</w:t>
-            </w:r>
-          </w:p>
-        </w:tc>
-        <w:tc>
-          <w:tcPr>
-            <w:tcW w:type="dxa" w:w="1440"/>
-          </w:tcPr>
-          <w:p>
-            <w:r>
-              <w:rPr>
-                <w:sz w:val="20"/>
-              </w:rPr>
-              <w:t>0.0%</w:t>
-            </w:r>
-          </w:p>
-        </w:tc>
-        <w:tc>
-          <w:tcPr>
-            <w:tcW w:type="dxa" w:w="1872"/>
-          </w:tcPr>
-          <w:p>
-            <w:r>
-              <w:rPr>
-                <w:sz w:val="20"/>
-              </w:rPr>
-              <w:t>0</w:t>
-            </w:r>
-          </w:p>
-        </w:tc>
-        <w:tc>
-          <w:tcPr>
-            <w:tcW w:type="dxa" w:w="1440"/>
-          </w:tcPr>
-          <w:p>
-            <w:r>
-              <w:rPr>
-                <w:sz w:val="20"/>
-              </w:rPr>
-              <w:t>0.0%</w:t>
-            </w:r>
-          </w:p>
-        </w:tc>
-      </w:tr>
-      <w:tr>
-        <w:tc>
-          <w:tcPr>
-            <w:tcW w:type="dxa" w:w="1440"/>
-          </w:tcPr>
-          <w:p>
-            <w:r>
-              <w:rPr>
-                <w:sz w:val="20"/>
-              </w:rPr>
-              <w:t>0.4</w:t>
-            </w:r>
-          </w:p>
-        </w:tc>
-        <w:tc>
-          <w:tcPr>
-            <w:tcW w:type="dxa" w:w="1872"/>
-          </w:tcPr>
-          <w:p>
-            <w:r>
-              <w:rPr>
-                <w:sz w:val="20"/>
-              </w:rPr>
-              <w:t>34</w:t>
-            </w:r>
-          </w:p>
-        </w:tc>
-        <w:tc>
-          <w:tcPr>
-            <w:tcW w:type="dxa" w:w="1440"/>
-          </w:tcPr>
-          <w:p>
-            <w:r>
-              <w:rPr>
-                <w:sz w:val="20"/>
-              </w:rPr>
-              <w:t>20.9%</w:t>
-            </w:r>
-          </w:p>
-        </w:tc>
-        <w:tc>
-          <w:tcPr>
-            <w:tcW w:type="dxa" w:w="1872"/>
-          </w:tcPr>
-          <w:p>
-            <w:r>
-              <w:rPr>
-                <w:sz w:val="20"/>
-              </w:rPr>
-              <w:t>128</w:t>
-            </w:r>
-          </w:p>
-        </w:tc>
-        <w:tc>
-          <w:tcPr>
-            <w:tcW w:type="dxa" w:w="1440"/>
-          </w:tcPr>
-          <w:p>
-            <w:r>
-              <w:rPr>
-                <w:sz w:val="20"/>
-              </w:rPr>
-              <w:t>78.5%</w:t>
-            </w:r>
-          </w:p>
-        </w:tc>
-      </w:tr>
-      <w:tr>
-        <w:tc>
-          <w:tcPr>
-            <w:tcW w:type="dxa" w:w="1440"/>
-          </w:tcPr>
-          <w:p>
-            <w:r>
-              <w:rPr>
-                <w:sz w:val="20"/>
-              </w:rPr>
-              <w:t>0.6</w:t>
-            </w:r>
-          </w:p>
-        </w:tc>
-        <w:tc>
-          <w:tcPr>
-            <w:tcW w:type="dxa" w:w="1872"/>
-          </w:tcPr>
-          <w:p>
-            <w:r>
-              <w:rPr>
-                <w:sz w:val="20"/>
-              </w:rPr>
-              <w:t>129</w:t>
-            </w:r>
-          </w:p>
-        </w:tc>
-        <w:tc>
-          <w:tcPr>
-            <w:tcW w:type="dxa" w:w="1440"/>
-          </w:tcPr>
-          <w:p>
-            <w:r>
-              <w:rPr>
-                <w:sz w:val="20"/>
-              </w:rPr>
-              <w:t>79.1%</w:t>
-            </w:r>
-          </w:p>
-        </w:tc>
-        <w:tc>
-          <w:tcPr>
-            <w:tcW w:type="dxa" w:w="1872"/>
-          </w:tcPr>
-          <w:p>
-            <w:r>
-              <w:rPr>
-                <w:sz w:val="20"/>
-              </w:rPr>
-              <w:t>35</w:t>
-            </w:r>
-          </w:p>
-        </w:tc>
-        <w:tc>
-          <w:tcPr>
-            <w:tcW w:type="dxa" w:w="1440"/>
-          </w:tcPr>
-          <w:p>
-            <w:r>
-              <w:rPr>
-                <w:sz w:val="20"/>
-              </w:rPr>
-              <w:t>21.5%</w:t>
-            </w:r>
-          </w:p>
-        </w:tc>
-      </w:tr>
-      <w:tr>
-        <w:tc>
-          <w:tcPr>
-            <w:tcW w:type="dxa" w:w="1440"/>
-          </w:tcPr>
-          <w:p>
-            <w:r>
-              <w:rPr>
-                <w:sz w:val="20"/>
-              </w:rPr>
-              <w:t>0.8</w:t>
-            </w:r>
-          </w:p>
-        </w:tc>
-        <w:tc>
-          <w:tcPr>
-            <w:tcW w:type="dxa" w:w="1872"/>
-          </w:tcPr>
-          <w:p>
-            <w:r>
-              <w:rPr>
-                <w:sz w:val="20"/>
-              </w:rPr>
-              <w:t>0</w:t>
-            </w:r>
-          </w:p>
-        </w:tc>
-        <w:tc>
-          <w:tcPr>
-            <w:tcW w:type="dxa" w:w="1440"/>
-          </w:tcPr>
-          <w:p>
-            <w:r>
-              <w:rPr>
-                <w:sz w:val="20"/>
-              </w:rPr>
-              <w:t>0.0%</w:t>
-            </w:r>
-          </w:p>
-        </w:tc>
-        <w:tc>
-          <w:tcPr>
-            <w:tcW w:type="dxa" w:w="1872"/>
-          </w:tcPr>
-          <w:p>
-            <w:r>
-              <w:rPr>
-                <w:sz w:val="20"/>
-              </w:rPr>
-              <w:t>0</w:t>
-            </w:r>
-          </w:p>
-        </w:tc>
-        <w:tc>
-          <w:tcPr>
-            <w:tcW w:type="dxa" w:w="1440"/>
-          </w:tcPr>
-          <w:p>
-            <w:r>
-              <w:rPr>
-                <w:sz w:val="20"/>
-              </w:rPr>
-              <w:t>0.0%</w:t>
-            </w:r>
-          </w:p>
-        </w:tc>
-      </w:tr>
-      <w:tr>
-        <w:tc>
-          <w:tcPr>
-            <w:tcW w:type="dxa" w:w="1440"/>
-          </w:tcPr>
-          <w:p>
-            <w:r>
-              <w:rPr>
-                <w:sz w:val="20"/>
-              </w:rPr>
-              <w:t>1.0</w:t>
-            </w:r>
-          </w:p>
-        </w:tc>
-        <w:tc>
-          <w:tcPr>
-            <w:tcW w:type="dxa" w:w="1872"/>
-          </w:tcPr>
-          <w:p>
-            <w:r>
-              <w:rPr>
-                <w:sz w:val="20"/>
-              </w:rPr>
-              <w:t>0</w:t>
-            </w:r>
-          </w:p>
-        </w:tc>
-        <w:tc>
-          <w:tcPr>
-            <w:tcW w:type="dxa" w:w="1440"/>
-          </w:tcPr>
-          <w:p>
-            <w:r>
-              <w:rPr>
-                <w:sz w:val="20"/>
-              </w:rPr>
-              <w:t>0.0%</w:t>
-            </w:r>
-          </w:p>
-        </w:tc>
-        <w:tc>
-          <w:tcPr>
-            <w:tcW w:type="dxa" w:w="1872"/>
-          </w:tcPr>
-          <w:p>
-            <w:r>
-              <w:rPr>
-                <w:sz w:val="20"/>
-              </w:rPr>
-              <w:t>0</w:t>
-            </w:r>
-          </w:p>
-        </w:tc>
-        <w:tc>
-          <w:tcPr>
-            <w:tcW w:type="dxa" w:w="1440"/>
-          </w:tcPr>
-          <w:p>
-            <w:r>
-              <w:rPr>
-                <w:sz w:val="20"/>
-              </w:rPr>
-              <w:t>0.0%</w:t>
-            </w:r>
-          </w:p>
-        </w:tc>
-      </w:tr>
-    </w:tbl>
     <w:p>
       <w:pPr>
         <w:jc w:val="center"/>
@@ -2779,15 +2278,7 @@
           <w:color w:val="606060"/>
           <w:sz w:val="18"/>
         </w:rPr>
-        <w:t>Figura: Distribucion de p_bull: SPX casi siempre 0.6 (bullish); CMC casi siempre 0.4 (bearish). Sesgo fijo opuesto.</w:t>
-      </w:r>
-    </w:p>
-    <w:p>
-      <w:pPr>
-        <w:pStyle w:val="Heading3"/>
-      </w:pPr>
-      <w:r>
-        <w:t>4.1.3 Serie temporal walking vs rollout</w:t>
+        <w:t>Figura: Distribucion de p_bull.</w:t>
       </w:r>
     </w:p>
     <w:p>
@@ -2839,7 +2330,7 @@
           <w:color w:val="606060"/>
           <w:sz w:val="18"/>
         </w:rPr>
-        <w:t>Figura: walking (azul) vs rollout (rojo). Rollout colapsa por exposure bias.</w:t>
+        <w:t>Figura: walking vs rollout (rollout colapsa).</w:t>
       </w:r>
     </w:p>
     <w:p>
@@ -2847,7 +2338,7 @@
         <w:pStyle w:val="Heading3"/>
       </w:pPr>
       <w:r>
-        <w:t>4.1.4 Skill predictivo</w:t>
+        <w:t>4.1.1 Skill predictivo</w:t>
       </w:r>
     </w:p>
     <w:tbl>
@@ -2901,7 +2392,7 @@
                 <w:b/>
                 <w:sz w:val="20"/>
               </w:rPr>
-              <w:t>Correlacion p_bull vs r_real</w:t>
+              <w:t>Correlacion</w:t>
             </w:r>
           </w:p>
         </w:tc>
@@ -2991,58 +2482,6 @@
     </w:tbl>
     <w:p>
       <w:pPr>
-        <w:jc w:val="center"/>
-      </w:pPr>
-      <w:r>
-        <w:drawing>
-          <wp:inline xmlns:a="http://schemas.openxmlformats.org/drawingml/2006/main" xmlns:pic="http://schemas.openxmlformats.org/drawingml/2006/picture">
-            <wp:extent cx="5486400" cy="2288240"/>
-            <wp:docPr id="9" name="Picture 9"/>
-            <wp:cNvGraphicFramePr>
-              <a:graphicFrameLocks noChangeAspect="1"/>
-            </wp:cNvGraphicFramePr>
-            <a:graphic>
-              <a:graphicData uri="http://schemas.openxmlformats.org/drawingml/2006/picture">
-                <pic:pic>
-                  <pic:nvPicPr>
-                    <pic:cNvPr id="0" name="12_pbull_vs_real.png"/>
-                    <pic:cNvPicPr/>
-                  </pic:nvPicPr>
-                  <pic:blipFill>
-                    <a:blip r:embed="rId17"/>
-                    <a:stretch>
-                      <a:fillRect/>
-                    </a:stretch>
-                  </pic:blipFill>
-                  <pic:spPr>
-                    <a:xfrm>
-                      <a:off x="0" y="0"/>
-                      <a:ext cx="5486400" cy="2288240"/>
-                    </a:xfrm>
-                    <a:prstGeom prst="rect"/>
-                  </pic:spPr>
-                </pic:pic>
-              </a:graphicData>
-            </a:graphic>
-          </wp:inline>
-        </w:drawing>
-      </w:r>
-    </w:p>
-    <w:p>
-      <w:pPr>
-        <w:jc w:val="center"/>
-      </w:pPr>
-      <w:r>
-        <w:rPr>
-          <w:i/>
-          <w:color w:val="606060"/>
-          <w:sz w:val="18"/>
-        </w:rPr>
-        <w:t>Figura: p_bull predicho vs signo real (verde=r&gt;0, rojo=r&lt;=0). CMC tiene patron invertido - muchos rojos en p_bull=0.6.</w:t>
-      </w:r>
-    </w:p>
-    <w:p>
-      <w:pPr>
         <w:ind w:left="576" w:right="576"/>
       </w:pPr>
       <w:r>
@@ -3050,7 +2489,7 @@
           <w:i/>
           <w:sz w:val="20"/>
         </w:rPr>
-        <w:t>CMC: correlacion NEGATIVA (-0.158). Cuando el LSTM dice "bull" para CMC, en promedio CMC BAJA. El LSTM aprendio momentum pero CMC es mean-reverting -&gt; patron opuesto.</w:t>
+        <w:t>CMC: correlacion NEGATIVA. Cuando el LSTM dice "bull", CMC en promedio BAJA. El LSTM aprendio momentum pero CMC es mean-reverting.</w:t>
       </w:r>
     </w:p>
     <w:p>
@@ -3058,7 +2497,7 @@
         <w:pStyle w:val="Heading2"/>
       </w:pPr>
       <w:r>
-        <w:t>4.2 Los 4 valores condicionales mu_hat</w:t>
+        <w:t>4.2 mu_hat condicional</w:t>
       </w:r>
     </w:p>
     <w:p>
@@ -3077,47 +2516,11 @@
       </w:r>
     </w:p>
     <w:p>
-      <w:r>
-        <w:rPr>
-          <w:b/>
-        </w:rPr>
-        <w:t>Observaciones criticas:</w:t>
-      </w:r>
-    </w:p>
-    <w:p>
-      <w:pPr>
-        <w:pStyle w:val="ListNumber"/>
-      </w:pPr>
-      <w:r>
-        <w:rPr>
-          <w:b/>
-        </w:rPr>
-        <w:t xml:space="preserve">SPX: </w:t>
-      </w:r>
-      <w:r>
-        <w:t>gap practicamente cero (0.03%). El HMM no separa nada para SPX.</w:t>
-      </w:r>
-    </w:p>
-    <w:p>
-      <w:pPr>
-        <w:pStyle w:val="ListNumber"/>
-      </w:pPr>
-      <w:r>
-        <w:rPr>
-          <w:b/>
-        </w:rPr>
-        <w:t xml:space="preserve">CMC: </w:t>
-      </w:r>
-      <w:r>
-        <w:t>mu_hat(bear) &gt;&gt; mu_hat(bull). El HMM identifica como "bear" periodos con MAYOR retorno medio en cripto (probablemente captura alta volatilidad).</w:t>
-      </w:r>
-    </w:p>
-    <w:p>
       <w:pPr>
         <w:pStyle w:val="Heading2"/>
       </w:pPr>
       <w:r>
-        <w:t>4.3 mu_mix(t) es practicamente constante</w:t>
+        <w:t>4.3 mu_mix(t)</w:t>
       </w:r>
     </w:p>
     <w:tbl>
@@ -3199,7 +2602,7 @@
               <w:rPr>
                 <w:sz w:val="20"/>
               </w:rPr>
-              <w:t>+0.193%/sem</w:t>
+              <w:t>+0.193%/sem (20.9%)</w:t>
             </w:r>
           </w:p>
         </w:tc>
@@ -3212,7 +2615,7 @@
               <w:rPr>
                 <w:sz w:val="20"/>
               </w:rPr>
-              <w:t>+0.187%/sem</w:t>
+              <w:t>+0.187%/sem (79.1%)</w:t>
             </w:r>
           </w:p>
         </w:tc>
@@ -3267,7 +2670,7 @@
         <w:drawing>
           <wp:inline xmlns:a="http://schemas.openxmlformats.org/drawingml/2006/main" xmlns:pic="http://schemas.openxmlformats.org/drawingml/2006/picture">
             <wp:extent cx="5486400" cy="1693027"/>
-            <wp:docPr id="10" name="Picture 10"/>
+            <wp:docPr id="9" name="Picture 9"/>
             <wp:cNvGraphicFramePr>
               <a:graphicFrameLocks noChangeAspect="1"/>
             </wp:cNvGraphicFramePr>
@@ -3279,7 +2682,7 @@
                     <pic:cNvPicPr/>
                   </pic:nvPicPr>
                   <pic:blipFill>
-                    <a:blip r:embed="rId18"/>
+                    <a:blip r:embed="rId17"/>
                     <a:stretch>
                       <a:fillRect/>
                     </a:stretch>
@@ -3308,7 +2711,7 @@
           <w:color w:val="606060"/>
           <w:sz w:val="18"/>
         </w:rPr>
-        <w:t>Figura: Serie temporal mu_mix(t) con p_hist - practicamente plana.</w:t>
+        <w:t>Figura: Serie temporal mu_mix(t) con phist.</w:t>
       </w:r>
     </w:p>
     <w:p>
@@ -3319,7 +2722,7 @@
         <w:drawing>
           <wp:inline xmlns:a="http://schemas.openxmlformats.org/drawingml/2006/main" xmlns:pic="http://schemas.openxmlformats.org/drawingml/2006/picture">
             <wp:extent cx="5486400" cy="1693027"/>
-            <wp:docPr id="11" name="Picture 11"/>
+            <wp:docPr id="10" name="Picture 10"/>
             <wp:cNvGraphicFramePr>
               <a:graphicFrameLocks noChangeAspect="1"/>
             </wp:cNvGraphicFramePr>
@@ -3331,7 +2734,7 @@
                     <pic:cNvPicPr/>
                   </pic:nvPicPr>
                   <pic:blipFill>
-                    <a:blip r:embed="rId19"/>
+                    <a:blip r:embed="rId18"/>
                     <a:stretch>
                       <a:fillRect/>
                     </a:stretch>
@@ -3368,7 +2771,7 @@
         <w:pStyle w:val="Heading2"/>
       </w:pPr>
       <w:r>
-        <w:t>4.4 El gap siempre favorece CMC</w:t>
+        <w:t>4.4 El gap mu_mix(SPX) - mu_mix(CMC)</w:t>
       </w:r>
     </w:p>
     <w:tbl>
@@ -3379,14 +2782,15 @@
         <w:tblLook w:firstColumn="1" w:firstRow="1" w:lastColumn="0" w:lastRow="0" w:noHBand="0" w:noVBand="1" w:val="04A0"/>
       </w:tblPr>
       <w:tblGrid>
-        <w:gridCol w:w="3312"/>
-        <w:gridCol w:w="3312"/>
-        <w:gridCol w:w="3312"/>
+        <w:gridCol w:w="2484"/>
+        <w:gridCol w:w="2484"/>
+        <w:gridCol w:w="2484"/>
+        <w:gridCol w:w="2484"/>
       </w:tblGrid>
       <w:tr>
         <w:tc>
           <w:tcPr>
-            <w:tcW w:type="dxa" w:w="2160"/>
+            <w:tcW w:type="dxa" w:w="1728"/>
           </w:tcPr>
           <w:p>
             <w:r>
@@ -3400,7 +2804,7 @@
         </w:tc>
         <w:tc>
           <w:tcPr>
-            <w:tcW w:type="dxa" w:w="2160"/>
+            <w:tcW w:type="dxa" w:w="1728"/>
           </w:tcPr>
           <w:p>
             <w:r>
@@ -3414,7 +2818,7 @@
         </w:tc>
         <w:tc>
           <w:tcPr>
-            <w:tcW w:type="dxa" w:w="2160"/>
+            <w:tcW w:type="dxa" w:w="1440"/>
           </w:tcPr>
           <w:p>
             <w:r>
@@ -3426,11 +2830,25 @@
             </w:r>
           </w:p>
         </w:tc>
+        <w:tc>
+          <w:tcPr>
+            <w:tcW w:type="dxa" w:w="3600"/>
+          </w:tcPr>
+          <w:p>
+            <w:r>
+              <w:rPr>
+                <w:b/>
+                <w:sz w:val="20"/>
+              </w:rPr>
+              <w:t>Decision</w:t>
+            </w:r>
+          </w:p>
+        </w:tc>
       </w:tr>
       <w:tr>
         <w:tc>
           <w:tcPr>
-            <w:tcW w:type="dxa" w:w="2160"/>
+            <w:tcW w:type="dxa" w:w="1728"/>
           </w:tcPr>
           <w:p>
             <w:r>
@@ -3443,7 +2861,7 @@
         </w:tc>
         <w:tc>
           <w:tcPr>
-            <w:tcW w:type="dxa" w:w="2160"/>
+            <w:tcW w:type="dxa" w:w="1728"/>
           </w:tcPr>
           <w:p>
             <w:r>
@@ -3456,7 +2874,7 @@
         </w:tc>
         <w:tc>
           <w:tcPr>
-            <w:tcW w:type="dxa" w:w="2160"/>
+            <w:tcW w:type="dxa" w:w="1440"/>
           </w:tcPr>
           <w:p>
             <w:r>
@@ -3467,11 +2885,24 @@
             </w:r>
           </w:p>
         </w:tc>
+        <w:tc>
+          <w:tcPr>
+            <w:tcW w:type="dxa" w:w="3600"/>
+          </w:tcPr>
+          <w:p>
+            <w:r>
+              <w:rPr>
+                <w:sz w:val="20"/>
+              </w:rPr>
+              <w:t>100% CMC</w:t>
+            </w:r>
+          </w:p>
+        </w:tc>
       </w:tr>
       <w:tr>
         <w:tc>
           <w:tcPr>
-            <w:tcW w:type="dxa" w:w="2160"/>
+            <w:tcW w:type="dxa" w:w="1728"/>
           </w:tcPr>
           <w:p>
             <w:r>
@@ -3484,7 +2915,7 @@
         </w:tc>
         <w:tc>
           <w:tcPr>
-            <w:tcW w:type="dxa" w:w="2160"/>
+            <w:tcW w:type="dxa" w:w="1728"/>
           </w:tcPr>
           <w:p>
             <w:r>
@@ -3497,7 +2928,7 @@
         </w:tc>
         <w:tc>
           <w:tcPr>
-            <w:tcW w:type="dxa" w:w="2160"/>
+            <w:tcW w:type="dxa" w:w="1440"/>
           </w:tcPr>
           <w:p>
             <w:r>
@@ -3508,11 +2939,24 @@
             </w:r>
           </w:p>
         </w:tc>
+        <w:tc>
+          <w:tcPr>
+            <w:tcW w:type="dxa" w:w="3600"/>
+          </w:tcPr>
+          <w:p>
+            <w:r>
+              <w:rPr>
+                <w:sz w:val="20"/>
+              </w:rPr>
+              <w:t>100% CMC</w:t>
+            </w:r>
+          </w:p>
+        </w:tc>
       </w:tr>
       <w:tr>
         <w:tc>
           <w:tcPr>
-            <w:tcW w:type="dxa" w:w="2160"/>
+            <w:tcW w:type="dxa" w:w="1728"/>
           </w:tcPr>
           <w:p>
             <w:r>
@@ -3525,7 +2969,7 @@
         </w:tc>
         <w:tc>
           <w:tcPr>
-            <w:tcW w:type="dxa" w:w="2160"/>
+            <w:tcW w:type="dxa" w:w="1728"/>
           </w:tcPr>
           <w:p>
             <w:r>
@@ -3538,7 +2982,7 @@
         </w:tc>
         <w:tc>
           <w:tcPr>
-            <w:tcW w:type="dxa" w:w="2160"/>
+            <w:tcW w:type="dxa" w:w="1440"/>
           </w:tcPr>
           <w:p>
             <w:r>
@@ -3549,11 +2993,24 @@
             </w:r>
           </w:p>
         </w:tc>
+        <w:tc>
+          <w:tcPr>
+            <w:tcW w:type="dxa" w:w="3600"/>
+          </w:tcPr>
+          <w:p>
+            <w:r>
+              <w:rPr>
+                <w:sz w:val="20"/>
+              </w:rPr>
+              <w:t>100% CMC</w:t>
+            </w:r>
+          </w:p>
+        </w:tc>
       </w:tr>
       <w:tr>
         <w:tc>
           <w:tcPr>
-            <w:tcW w:type="dxa" w:w="2160"/>
+            <w:tcW w:type="dxa" w:w="1728"/>
           </w:tcPr>
           <w:p>
             <w:r>
@@ -3566,7 +3023,7 @@
         </w:tc>
         <w:tc>
           <w:tcPr>
-            <w:tcW w:type="dxa" w:w="2160"/>
+            <w:tcW w:type="dxa" w:w="1728"/>
           </w:tcPr>
           <w:p>
             <w:r>
@@ -3579,7 +3036,7 @@
         </w:tc>
         <w:tc>
           <w:tcPr>
-            <w:tcW w:type="dxa" w:w="2160"/>
+            <w:tcW w:type="dxa" w:w="1440"/>
           </w:tcPr>
           <w:p>
             <w:r>
@@ -3587,6 +3044,19 @@
                 <w:sz w:val="20"/>
               </w:rPr>
               <w:t>2.5%</w:t>
+            </w:r>
+          </w:p>
+        </w:tc>
+        <w:tc>
+          <w:tcPr>
+            <w:tcW w:type="dxa" w:w="3600"/>
+          </w:tcPr>
+          <w:p>
+            <w:r>
+              <w:rPr>
+                <w:sz w:val="20"/>
+              </w:rPr>
+              <w:t>100% CMC</w:t>
             </w:r>
           </w:p>
         </w:tc>
@@ -3601,7 +3071,7 @@
           <w:i/>
           <w:sz w:val="20"/>
         </w:rPr>
-        <w:t>100% de las semanas el gap favorece a CMC. NUNCA SPX. NUNCA empate.</w:t>
+        <w:t>100% favor CMC. NUNCA SPX. NUNCA empate.</w:t>
       </w:r>
     </w:p>
     <w:p>
@@ -3609,7 +3079,7 @@
         <w:pStyle w:val="Heading2"/>
       </w:pPr>
       <w:r>
-        <w:t>4.5 Politica bajo g*=(0.30, 0.50)</w:t>
+        <w:t>4.5 Politica seleccionada</w:t>
       </w:r>
     </w:p>
     <w:p>
@@ -3626,9 +3096,9 @@
         <w:br/>
         <w:t xml:space="preserve">  mean = 0.000   std = 0.000</w:t>
         <w:br/>
-        <w:t xml:space="preserve">  100% sem en w_SPX &lt; 0.1</w:t>
+        <w:t xml:space="preserve">  Turnover total: 0.00</w:t>
         <w:br/>
-        <w:t xml:space="preserve">  Turnover total: 0.00</w:t>
+        <w:t xml:space="preserve">  Hit rate timing: 52.1% (N/A sin timing)</w:t>
       </w:r>
     </w:p>
     <w:p>
@@ -3639,7 +3109,7 @@
         <w:drawing>
           <wp:inline xmlns:a="http://schemas.openxmlformats.org/drawingml/2006/main" xmlns:pic="http://schemas.openxmlformats.org/drawingml/2006/picture">
             <wp:extent cx="5486400" cy="1657608"/>
-            <wp:docPr id="12" name="Picture 12"/>
+            <wp:docPr id="11" name="Picture 11"/>
             <wp:cNvGraphicFramePr>
               <a:graphicFrameLocks noChangeAspect="1"/>
             </wp:cNvGraphicFramePr>
@@ -3651,7 +3121,7 @@
                     <pic:cNvPicPr/>
                   </pic:nvPicPr>
                   <pic:blipFill>
-                    <a:blip r:embed="rId20"/>
+                    <a:blip r:embed="rId19"/>
                     <a:stretch>
                       <a:fillRect/>
                     </a:stretch>
@@ -3680,61 +3150,25 @@
           <w:color w:val="606060"/>
           <w:sz w:val="18"/>
         </w:rPr>
-        <w:t>Figura: Politica w(t) - 100% CMC durante 163 semanas.</w:t>
+        <w:t>Figura: Politica w(t) seleccionada con phist.</w:t>
+      </w:r>
+    </w:p>
+    <w:p>
+      <w:r>
+        <w:br w:type="page"/>
       </w:r>
     </w:p>
     <w:p>
       <w:pPr>
-        <w:pStyle w:val="Heading2"/>
+        <w:pStyle w:val="Heading1"/>
       </w:pPr>
       <w:r>
-        <w:t>4.6 Cadena completa: como mu_hat y mu_mix afectan al optimizador</w:t>
+        <w:t>5. Cadena mu_hat -&gt; mu_mix -&gt; optimizador</w:t>
       </w:r>
     </w:p>
     <w:p>
       <w:r>
-        <w:t>Esta seccion sintetiza con aritmetica concreta como las creencias del LSTM (p_bull) se combinan con las estimaciones historicas (mu_hat) para producir mu_mix(t), y como el optimizador finalmente toma decisiones.</w:t>
-      </w:r>
-    </w:p>
-    <w:p>
-      <w:pPr>
-        <w:pStyle w:val="Heading3"/>
-      </w:pPr>
-      <w:r>
-        <w:t>4.6.1 Que es mu_hat conceptualmente</w:t>
-      </w:r>
-    </w:p>
-    <w:p>
-      <w:r>
-        <w:t>mu_hat(i, k) es el retorno medio historico del activo i cuando estuvo en regimen k. Es un estimador estadistico sobre datos pasados, calculado UNA SOLA VEZ antes del optimizador. Son 4 numeros fijos (no dependen de t):</w:t>
-      </w:r>
-    </w:p>
-    <w:p>
-      <w:pPr>
-        <w:spacing w:before="80" w:after="80"/>
-        <w:ind w:left="432"/>
-      </w:pPr>
-      <w:r>
-        <w:rPr>
-          <w:rFonts w:ascii="Consolas" w:hAnsi="Consolas"/>
-          <w:sz w:val="18"/>
-        </w:rPr>
-        <w:t>mu_hat(SPX, bull) = +0.175%/sem    mu_hat(SPX, bear) = +0.205%/sem</w:t>
-        <w:br/>
-        <w:t>mu_hat(CMC, bull) = +0.283%/sem    mu_hat(CMC, bear) = +0.865%/sem</w:t>
-      </w:r>
-    </w:p>
-    <w:p>
-      <w:pPr>
-        <w:pStyle w:val="Heading3"/>
-      </w:pPr>
-      <w:r>
-        <w:t>4.6.2 Como se construye mu_mix(i, t)</w:t>
-      </w:r>
-    </w:p>
-    <w:p>
-      <w:r>
-        <w:t>mu_mix(i, t) es una media ponderada de los mu_hat condicionales, donde los pesos son las CREENCIAS del LSTM sobre el regimen en cada t:</w:t>
+        <w:t>mu_hat son 4 numeros FIJOS calculados sobre el historico (retorno medio por activo y regimen). mu_mix(i, t) es una media ponderada de los mu_hat con pesos p_bull(t) del LSTM:</w:t>
       </w:r>
     </w:p>
     <w:p>
@@ -3751,19 +3185,11 @@
       </w:r>
     </w:p>
     <w:p>
-      <w:pPr>
-        <w:pStyle w:val="Heading3"/>
-      </w:pPr>
-      <w:r>
-        <w:t>4.6.3 Ejemplo numerico: SPX</w:t>
-      </w:r>
-    </w:p>
-    <w:p>
       <w:r>
         <w:rPr>
           <w:b/>
         </w:rPr>
-        <w:t>Cuando el LSTM dice "mas bullish" (p_bull = 0.6):</w:t>
+        <w:t>Reescrito en terminos del gap, el optimizador resuelve:</w:t>
       </w:r>
     </w:p>
     <w:p>
@@ -3776,11 +3202,16 @@
           <w:rFonts w:ascii="Consolas" w:hAnsi="Consolas"/>
           <w:sz w:val="18"/>
         </w:rPr>
-        <w:t>mu_mix(SPX, t) = 0.6 * 0.175% + 0.4 * 0.205%</w:t>
+        <w:t>retorno(w, t) = mu_mix(CMC, t) + w * gap(t)</w:t>
         <w:br/>
-        <w:t xml:space="preserve">              = 0.105% + 0.082%</w:t>
+        <w:t xml:space="preserve">  donde gap(t) = mu_mix(SPX, t) - mu_mix(CMC, t)</w:t>
         <w:br/>
-        <w:t xml:space="preserve">              = +0.187%/sem</w:t>
+        <w:br/>
+        <w:t>Si gap &gt; 0 -&gt; w* tiende a 1 (mas SPX)</w:t>
+        <w:br/>
+        <w:t>Si gap &lt; 0 -&gt; w* tiende a 0 (mas CMC)</w:t>
+        <w:br/>
+        <w:t>La varianza tira hacia min-var (mayormente SPX, sigma_CMC &gt;&gt; sigma_SPX).</w:t>
       </w:r>
     </w:p>
     <w:p>
@@ -3788,923 +3219,12 @@
         <w:rPr>
           <w:b/>
         </w:rPr>
-        <w:t>Cuando el LSTM dice "mas bearish" (p_bull = 0.4):</w:t>
-      </w:r>
-    </w:p>
-    <w:p>
-      <w:pPr>
-        <w:spacing w:before="80" w:after="80"/>
-        <w:ind w:left="432"/>
-      </w:pPr>
-      <w:r>
-        <w:rPr>
-          <w:rFonts w:ascii="Consolas" w:hAnsi="Consolas"/>
-          <w:sz w:val="18"/>
-        </w:rPr>
-        <w:t>mu_mix(SPX, t) = 0.4 * 0.175% + 0.6 * 0.205%</w:t>
-        <w:br/>
-        <w:t xml:space="preserve">              = 0.070% + 0.123%</w:t>
-        <w:br/>
-        <w:t xml:space="preserve">              = +0.193%/sem</w:t>
-      </w:r>
-    </w:p>
-    <w:p>
-      <w:pPr>
-        <w:ind w:left="576" w:right="576"/>
-      </w:pPr>
-      <w:r>
-        <w:rPr>
-          <w:i/>
-          <w:sz w:val="20"/>
-        </w:rPr>
-        <w:t>OBSERVACION BIZARRA: para SPX, cuando el LSTM dice "bearish" (p_bull=0.4), mu_mix resulta MAS ALTO (+0.193% &gt; +0.187%). Esto es porque mu_hat(SPX, bear) &gt; mu_hat(SPX, bull) segun el HMM. Las "creencias" del LSTM apenas mueven la señal (variacion 0.006%).</w:t>
-      </w:r>
-    </w:p>
-    <w:p>
-      <w:pPr>
-        <w:pStyle w:val="Heading3"/>
-      </w:pPr>
-      <w:r>
-        <w:t>4.6.4 Ejemplo numerico: CMC</w:t>
+        <w:t>Con p_hist:</w:t>
       </w:r>
     </w:p>
     <w:p>
       <w:r>
-        <w:rPr>
-          <w:b/>
-        </w:rPr>
-        <w:t>Cuando el LSTM dice "bullish CMC" (p_bull = 0.6):</w:t>
-      </w:r>
-    </w:p>
-    <w:p>
-      <w:pPr>
-        <w:spacing w:before="80" w:after="80"/>
-        <w:ind w:left="432"/>
-      </w:pPr>
-      <w:r>
-        <w:rPr>
-          <w:rFonts w:ascii="Consolas" w:hAnsi="Consolas"/>
-          <w:sz w:val="18"/>
-        </w:rPr>
-        <w:t>mu_mix(CMC, t) = 0.6 * 0.283% + 0.4 * 0.865%</w:t>
-        <w:br/>
-        <w:t xml:space="preserve">              = 0.170% + 0.346%</w:t>
-        <w:br/>
-        <w:t xml:space="preserve">              = +0.516%/sem</w:t>
-      </w:r>
-    </w:p>
-    <w:p>
-      <w:r>
-        <w:rPr>
-          <w:b/>
-        </w:rPr>
-        <w:t>Cuando el LSTM dice "bearish CMC" (p_bull = 0.4):</w:t>
-      </w:r>
-    </w:p>
-    <w:p>
-      <w:pPr>
-        <w:spacing w:before="80" w:after="80"/>
-        <w:ind w:left="432"/>
-      </w:pPr>
-      <w:r>
-        <w:rPr>
-          <w:rFonts w:ascii="Consolas" w:hAnsi="Consolas"/>
-          <w:sz w:val="18"/>
-        </w:rPr>
-        <w:t>mu_mix(CMC, t) = 0.4 * 0.283% + 0.6 * 0.865%</w:t>
-        <w:br/>
-        <w:t xml:space="preserve">              = 0.113% + 0.519%</w:t>
-        <w:br/>
-        <w:t xml:space="preserve">              = +0.633%/sem</w:t>
-      </w:r>
-    </w:p>
-    <w:p>
-      <w:pPr>
-        <w:ind w:left="576" w:right="576"/>
-      </w:pPr>
-      <w:r>
-        <w:rPr>
-          <w:i/>
-          <w:sz w:val="20"/>
-        </w:rPr>
-        <w:t>MISMA INVERSION AMPLIFICADA: cuando el LSTM dice "bearish CMC", mu_mix(CMC) es MAS ALTO (+0.633% &gt; +0.516%). Razon: mu_hat(CMC, bear) = +0.865% es el valor mas alto de los 4 - el "bear" del HMM en cripto identifica periodos de alta volatilidad con mayor retorno medio.</w:t>
-      </w:r>
-    </w:p>
-    <w:p>
-      <w:pPr>
-        <w:pStyle w:val="Heading3"/>
-      </w:pPr>
-      <w:r>
-        <w:t>4.6.5 Como el optimizador "lee" mu_mix</w:t>
-      </w:r>
-    </w:p>
-    <w:p>
-      <w:r>
-        <w:t>El optimizador resuelve, para cada semana t, una version del problema clasico de Markowitz (con costos):</w:t>
-      </w:r>
-    </w:p>
-    <w:p>
-      <w:pPr>
-        <w:spacing w:before="80" w:after="80"/>
-        <w:ind w:left="432"/>
-      </w:pPr>
-      <w:r>
-        <w:rPr>
-          <w:rFonts w:ascii="Consolas" w:hAnsi="Consolas"/>
-          <w:sz w:val="18"/>
-        </w:rPr>
-        <w:t>max  z = w * mu_mix(SPX, t) + (1-w) * mu_mix(CMC, t)   &lt;- retorno esperado</w:t>
-        <w:br/>
-        <w:t xml:space="preserve">       - lambda * Var(w, t)                            &lt;- penalizacion riesgo</w:t>
-        <w:br/>
-        <w:t xml:space="preserve">       - m * c * |Delta w|                             &lt;- costo rebalanceo</w:t>
-      </w:r>
-    </w:p>
-    <w:p>
-      <w:r>
-        <w:rPr>
-          <w:b/>
-        </w:rPr>
-        <w:t>Reescribiendo el retorno esperado en terminos del GAP:</w:t>
-      </w:r>
-    </w:p>
-    <w:p>
-      <w:pPr>
-        <w:spacing w:before="80" w:after="80"/>
-        <w:ind w:left="432"/>
-      </w:pPr>
-      <w:r>
-        <w:rPr>
-          <w:rFonts w:ascii="Consolas" w:hAnsi="Consolas"/>
-          <w:sz w:val="18"/>
-        </w:rPr>
-        <w:t>retorno(w, t) = mu_mix(CMC, t) + w * [mu_mix(SPX, t) - mu_mix(CMC, t)]</w:t>
-        <w:br/>
-        <w:t xml:space="preserve">             = mu_mix(CMC, t) + w * gap(t)</w:t>
-        <w:br/>
-        <w:br/>
-        <w:t>Lectura: el optimizador mira el GAP para decidir.</w:t>
-        <w:br/>
-        <w:t xml:space="preserve">  Si gap &gt; 0 -&gt; mas retorno con mas SPX -&gt; w* tiende a 1</w:t>
-        <w:br/>
-        <w:t xml:space="preserve">  Si gap &lt; 0 -&gt; mas retorno con mas CMC -&gt; w* tiende a 0</w:t>
-        <w:br/>
-        <w:t>La varianza tira hacia min-var (mayormente SPX, porque sigma_CMC &gt;&gt; sigma_SPX).</w:t>
-      </w:r>
-    </w:p>
-    <w:p>
-      <w:pPr>
-        <w:pStyle w:val="Heading3"/>
-      </w:pPr>
-      <w:r>
-        <w:t>4.6.6 Las 4 combinaciones posibles del gap con p_hist</w:t>
-      </w:r>
-    </w:p>
-    <w:tbl>
-      <w:tblPr>
-        <w:tblStyle w:val="LightGrid-Accent1"/>
-        <w:tblW w:type="auto" w:w="0"/>
-        <w:jc w:val="center"/>
-        <w:tblLook w:firstColumn="1" w:firstRow="1" w:lastColumn="0" w:lastRow="0" w:noHBand="0" w:noVBand="1" w:val="04A0"/>
-      </w:tblPr>
-      <w:tblGrid>
-        <w:gridCol w:w="1987"/>
-        <w:gridCol w:w="1987"/>
-        <w:gridCol w:w="1987"/>
-        <w:gridCol w:w="1987"/>
-        <w:gridCol w:w="1987"/>
-      </w:tblGrid>
-      <w:tr>
-        <w:tc>
-          <w:tcPr>
-            <w:tcW w:type="dxa" w:w="1728"/>
-          </w:tcPr>
-          <w:p>
-            <w:r>
-              <w:rPr>
-                <w:b/>
-                <w:sz w:val="20"/>
-              </w:rPr>
-              <w:t>p_bull(SPX)</w:t>
-            </w:r>
-          </w:p>
-        </w:tc>
-        <w:tc>
-          <w:tcPr>
-            <w:tcW w:type="dxa" w:w="1728"/>
-          </w:tcPr>
-          <w:p>
-            <w:r>
-              <w:rPr>
-                <w:b/>
-                <w:sz w:val="20"/>
-              </w:rPr>
-              <w:t>p_bull(CMC)</w:t>
-            </w:r>
-          </w:p>
-        </w:tc>
-        <w:tc>
-          <w:tcPr>
-            <w:tcW w:type="dxa" w:w="1584"/>
-          </w:tcPr>
-          <w:p>
-            <w:r>
-              <w:rPr>
-                <w:b/>
-                <w:sz w:val="20"/>
-              </w:rPr>
-              <w:t>mu_mix(SPX)</w:t>
-            </w:r>
-          </w:p>
-        </w:tc>
-        <w:tc>
-          <w:tcPr>
-            <w:tcW w:type="dxa" w:w="1584"/>
-          </w:tcPr>
-          <w:p>
-            <w:r>
-              <w:rPr>
-                <w:b/>
-                <w:sz w:val="20"/>
-              </w:rPr>
-              <w:t>mu_mix(CMC)</w:t>
-            </w:r>
-          </w:p>
-        </w:tc>
-        <w:tc>
-          <w:tcPr>
-            <w:tcW w:type="dxa" w:w="1584"/>
-          </w:tcPr>
-          <w:p>
-            <w:r>
-              <w:rPr>
-                <w:b/>
-                <w:sz w:val="20"/>
-              </w:rPr>
-              <w:t>gap</w:t>
-            </w:r>
-          </w:p>
-        </w:tc>
-      </w:tr>
-      <w:tr>
-        <w:tc>
-          <w:tcPr>
-            <w:tcW w:type="dxa" w:w="1728"/>
-          </w:tcPr>
-          <w:p>
-            <w:r>
-              <w:rPr>
-                <w:sz w:val="20"/>
-              </w:rPr>
-              <w:t>0.6</w:t>
-            </w:r>
-          </w:p>
-        </w:tc>
-        <w:tc>
-          <w:tcPr>
-            <w:tcW w:type="dxa" w:w="1728"/>
-          </w:tcPr>
-          <w:p>
-            <w:r>
-              <w:rPr>
-                <w:sz w:val="20"/>
-              </w:rPr>
-              <w:t>0.4</w:t>
-            </w:r>
-          </w:p>
-        </w:tc>
-        <w:tc>
-          <w:tcPr>
-            <w:tcW w:type="dxa" w:w="1584"/>
-          </w:tcPr>
-          <w:p>
-            <w:r>
-              <w:rPr>
-                <w:sz w:val="20"/>
-              </w:rPr>
-              <w:t>+0.187%</w:t>
-            </w:r>
-          </w:p>
-        </w:tc>
-        <w:tc>
-          <w:tcPr>
-            <w:tcW w:type="dxa" w:w="1584"/>
-          </w:tcPr>
-          <w:p>
-            <w:r>
-              <w:rPr>
-                <w:sz w:val="20"/>
-              </w:rPr>
-              <w:t>+0.633%</w:t>
-            </w:r>
-          </w:p>
-        </w:tc>
-        <w:tc>
-          <w:tcPr>
-            <w:tcW w:type="dxa" w:w="1584"/>
-          </w:tcPr>
-          <w:p>
-            <w:r>
-              <w:rPr>
-                <w:sz w:val="20"/>
-              </w:rPr>
-              <w:t>-0.446%</w:t>
-            </w:r>
-          </w:p>
-        </w:tc>
-      </w:tr>
-      <w:tr>
-        <w:tc>
-          <w:tcPr>
-            <w:tcW w:type="dxa" w:w="1728"/>
-          </w:tcPr>
-          <w:p>
-            <w:r>
-              <w:rPr>
-                <w:sz w:val="20"/>
-              </w:rPr>
-              <w:t>0.4</w:t>
-            </w:r>
-          </w:p>
-        </w:tc>
-        <w:tc>
-          <w:tcPr>
-            <w:tcW w:type="dxa" w:w="1728"/>
-          </w:tcPr>
-          <w:p>
-            <w:r>
-              <w:rPr>
-                <w:sz w:val="20"/>
-              </w:rPr>
-              <w:t>0.4</w:t>
-            </w:r>
-          </w:p>
-        </w:tc>
-        <w:tc>
-          <w:tcPr>
-            <w:tcW w:type="dxa" w:w="1584"/>
-          </w:tcPr>
-          <w:p>
-            <w:r>
-              <w:rPr>
-                <w:sz w:val="20"/>
-              </w:rPr>
-              <w:t>+0.193%</w:t>
-            </w:r>
-          </w:p>
-        </w:tc>
-        <w:tc>
-          <w:tcPr>
-            <w:tcW w:type="dxa" w:w="1584"/>
-          </w:tcPr>
-          <w:p>
-            <w:r>
-              <w:rPr>
-                <w:sz w:val="20"/>
-              </w:rPr>
-              <w:t>+0.633%</w:t>
-            </w:r>
-          </w:p>
-        </w:tc>
-        <w:tc>
-          <w:tcPr>
-            <w:tcW w:type="dxa" w:w="1584"/>
-          </w:tcPr>
-          <w:p>
-            <w:r>
-              <w:rPr>
-                <w:sz w:val="20"/>
-              </w:rPr>
-              <w:t>-0.440%</w:t>
-            </w:r>
-          </w:p>
-        </w:tc>
-      </w:tr>
-      <w:tr>
-        <w:tc>
-          <w:tcPr>
-            <w:tcW w:type="dxa" w:w="1728"/>
-          </w:tcPr>
-          <w:p>
-            <w:r>
-              <w:rPr>
-                <w:sz w:val="20"/>
-              </w:rPr>
-              <w:t>0.6</w:t>
-            </w:r>
-          </w:p>
-        </w:tc>
-        <w:tc>
-          <w:tcPr>
-            <w:tcW w:type="dxa" w:w="1728"/>
-          </w:tcPr>
-          <w:p>
-            <w:r>
-              <w:rPr>
-                <w:sz w:val="20"/>
-              </w:rPr>
-              <w:t>0.6</w:t>
-            </w:r>
-          </w:p>
-        </w:tc>
-        <w:tc>
-          <w:tcPr>
-            <w:tcW w:type="dxa" w:w="1584"/>
-          </w:tcPr>
-          <w:p>
-            <w:r>
-              <w:rPr>
-                <w:sz w:val="20"/>
-              </w:rPr>
-              <w:t>+0.187%</w:t>
-            </w:r>
-          </w:p>
-        </w:tc>
-        <w:tc>
-          <w:tcPr>
-            <w:tcW w:type="dxa" w:w="1584"/>
-          </w:tcPr>
-          <w:p>
-            <w:r>
-              <w:rPr>
-                <w:sz w:val="20"/>
-              </w:rPr>
-              <w:t>+0.516%</w:t>
-            </w:r>
-          </w:p>
-        </w:tc>
-        <w:tc>
-          <w:tcPr>
-            <w:tcW w:type="dxa" w:w="1584"/>
-          </w:tcPr>
-          <w:p>
-            <w:r>
-              <w:rPr>
-                <w:sz w:val="20"/>
-              </w:rPr>
-              <w:t>-0.329%</w:t>
-            </w:r>
-          </w:p>
-        </w:tc>
-      </w:tr>
-      <w:tr>
-        <w:tc>
-          <w:tcPr>
-            <w:tcW w:type="dxa" w:w="1728"/>
-          </w:tcPr>
-          <w:p>
-            <w:r>
-              <w:rPr>
-                <w:sz w:val="20"/>
-              </w:rPr>
-              <w:t>0.4</w:t>
-            </w:r>
-          </w:p>
-        </w:tc>
-        <w:tc>
-          <w:tcPr>
-            <w:tcW w:type="dxa" w:w="1728"/>
-          </w:tcPr>
-          <w:p>
-            <w:r>
-              <w:rPr>
-                <w:sz w:val="20"/>
-              </w:rPr>
-              <w:t>0.6</w:t>
-            </w:r>
-          </w:p>
-        </w:tc>
-        <w:tc>
-          <w:tcPr>
-            <w:tcW w:type="dxa" w:w="1584"/>
-          </w:tcPr>
-          <w:p>
-            <w:r>
-              <w:rPr>
-                <w:sz w:val="20"/>
-              </w:rPr>
-              <w:t>+0.193%</w:t>
-            </w:r>
-          </w:p>
-        </w:tc>
-        <w:tc>
-          <w:tcPr>
-            <w:tcW w:type="dxa" w:w="1584"/>
-          </w:tcPr>
-          <w:p>
-            <w:r>
-              <w:rPr>
-                <w:sz w:val="20"/>
-              </w:rPr>
-              <w:t>+0.516%</w:t>
-            </w:r>
-          </w:p>
-        </w:tc>
-        <w:tc>
-          <w:tcPr>
-            <w:tcW w:type="dxa" w:w="1584"/>
-          </w:tcPr>
-          <w:p>
-            <w:r>
-              <w:rPr>
-                <w:sz w:val="20"/>
-              </w:rPr>
-              <w:t>-0.323%</w:t>
-            </w:r>
-          </w:p>
-        </w:tc>
-      </w:tr>
-    </w:tbl>
-    <w:p>
-      <w:r>
-        <w:rPr>
-          <w:b/>
-        </w:rPr>
-        <w:t>TODAS las combinaciones dan gap NEGATIVO. mu_mix(CMC) &gt; mu_mix(SPX) en TODAS las semanas, estructuralmente, no por casualidad.</w:t>
-      </w:r>
-    </w:p>
-    <w:p>
-      <w:pPr>
-        <w:pStyle w:val="Heading3"/>
-      </w:pPr>
-      <w:r>
-        <w:t>4.6.7 El "tug-of-war" entre retorno y varianza</w:t>
-      </w:r>
-    </w:p>
-    <w:p>
-      <w:r>
-        <w:t>Cuanto pesa cada fuerza depende de lambda:</w:t>
-      </w:r>
-    </w:p>
-    <w:p>
-      <w:pPr>
-        <w:spacing w:before="80" w:after="80"/>
-        <w:ind w:left="432"/>
-      </w:pPr>
-      <w:r>
-        <w:rPr>
-          <w:rFonts w:ascii="Consolas" w:hAnsi="Consolas"/>
-          <w:sz w:val="18"/>
-        </w:rPr>
-        <w:t xml:space="preserve">    Retorno tira hacia CMC          Varianza tira hacia SPX</w:t>
-        <w:br/>
-        <w:t xml:space="preserve">    (porque gap &lt; 0)                (porque sigma_CMC &gt;&gt; sigma_SPX)</w:t>
-        <w:br/>
-        <w:t xml:space="preserve">               &lt;-----                          -----&gt;</w:t>
-        <w:br/>
-        <w:t xml:space="preserve">                           [w*_SPX]</w:t>
-      </w:r>
-    </w:p>
-    <w:tbl>
-      <w:tblPr>
-        <w:tblStyle w:val="LightGrid-Accent1"/>
-        <w:tblW w:type="auto" w:w="0"/>
-        <w:jc w:val="center"/>
-        <w:tblLook w:firstColumn="1" w:firstRow="1" w:lastColumn="0" w:lastRow="0" w:noHBand="0" w:noVBand="1" w:val="04A0"/>
-      </w:tblPr>
-      <w:tblGrid>
-        <w:gridCol w:w="3312"/>
-        <w:gridCol w:w="3312"/>
-        <w:gridCol w:w="3312"/>
-      </w:tblGrid>
-      <w:tr>
-        <w:tc>
-          <w:tcPr>
-            <w:tcW w:type="dxa" w:w="2160"/>
-          </w:tcPr>
-          <w:p>
-            <w:r>
-              <w:rPr>
-                <w:b/>
-                <w:sz w:val="20"/>
-              </w:rPr>
-              <w:t>lambda</w:t>
-            </w:r>
-          </w:p>
-        </w:tc>
-        <w:tc>
-          <w:tcPr>
-            <w:tcW w:type="dxa" w:w="2880"/>
-          </w:tcPr>
-          <w:p>
-            <w:r>
-              <w:rPr>
-                <w:b/>
-                <w:sz w:val="20"/>
-              </w:rPr>
-              <w:t>Quien gana</w:t>
-            </w:r>
-          </w:p>
-        </w:tc>
-        <w:tc>
-          <w:tcPr>
-            <w:tcW w:type="dxa" w:w="3600"/>
-          </w:tcPr>
-          <w:p>
-            <w:r>
-              <w:rPr>
-                <w:b/>
-                <w:sz w:val="20"/>
-              </w:rPr>
-              <w:t>Politica resultante</w:t>
-            </w:r>
-          </w:p>
-        </w:tc>
-      </w:tr>
-      <w:tr>
-        <w:tc>
-          <w:tcPr>
-            <w:tcW w:type="dxa" w:w="2160"/>
-          </w:tcPr>
-          <w:p>
-            <w:r>
-              <w:rPr>
-                <w:sz w:val="20"/>
-              </w:rPr>
-              <w:t>0.30 (chico)</w:t>
-            </w:r>
-          </w:p>
-        </w:tc>
-        <w:tc>
-          <w:tcPr>
-            <w:tcW w:type="dxa" w:w="2880"/>
-          </w:tcPr>
-          <w:p>
-            <w:r>
-              <w:rPr>
-                <w:sz w:val="20"/>
-              </w:rPr>
-              <w:t>Gana el retorno</w:t>
-            </w:r>
-          </w:p>
-        </w:tc>
-        <w:tc>
-          <w:tcPr>
-            <w:tcW w:type="dxa" w:w="3600"/>
-          </w:tcPr>
-          <w:p>
-            <w:r>
-              <w:rPr>
-                <w:sz w:val="20"/>
-              </w:rPr>
-              <w:t>w* = 0 -&gt; 100% CMC</w:t>
-            </w:r>
-          </w:p>
-        </w:tc>
-      </w:tr>
-      <w:tr>
-        <w:tc>
-          <w:tcPr>
-            <w:tcW w:type="dxa" w:w="2160"/>
-          </w:tcPr>
-          <w:p>
-            <w:r>
-              <w:rPr>
-                <w:sz w:val="20"/>
-              </w:rPr>
-              <w:t>0.90 (medio)</w:t>
-            </w:r>
-          </w:p>
-        </w:tc>
-        <w:tc>
-          <w:tcPr>
-            <w:tcW w:type="dxa" w:w="2880"/>
-          </w:tcPr>
-          <w:p>
-            <w:r>
-              <w:rPr>
-                <w:sz w:val="20"/>
-              </w:rPr>
-              <w:t>Empatan</w:t>
-            </w:r>
-          </w:p>
-        </w:tc>
-        <w:tc>
-          <w:tcPr>
-            <w:tcW w:type="dxa" w:w="3600"/>
-          </w:tcPr>
-          <w:p>
-            <w:r>
-              <w:rPr>
-                <w:sz w:val="20"/>
-              </w:rPr>
-              <w:t>w* ~ 0.48 -&gt; casi 50/50</w:t>
-            </w:r>
-          </w:p>
-        </w:tc>
-      </w:tr>
-      <w:tr>
-        <w:tc>
-          <w:tcPr>
-            <w:tcW w:type="dxa" w:w="2160"/>
-          </w:tcPr>
-          <w:p>
-            <w:r>
-              <w:rPr>
-                <w:sz w:val="20"/>
-              </w:rPr>
-              <w:t>1.80 (grande)</w:t>
-            </w:r>
-          </w:p>
-        </w:tc>
-        <w:tc>
-          <w:tcPr>
-            <w:tcW w:type="dxa" w:w="2880"/>
-          </w:tcPr>
-          <w:p>
-            <w:r>
-              <w:rPr>
-                <w:sz w:val="20"/>
-              </w:rPr>
-              <w:t>Gana la varianza</w:t>
-            </w:r>
-          </w:p>
-        </w:tc>
-        <w:tc>
-          <w:tcPr>
-            <w:tcW w:type="dxa" w:w="3600"/>
-          </w:tcPr>
-          <w:p>
-            <w:r>
-              <w:rPr>
-                <w:sz w:val="20"/>
-              </w:rPr>
-              <w:t>w* ~ 0.75 -&gt; mayormente SPX</w:t>
-            </w:r>
-          </w:p>
-        </w:tc>
-      </w:tr>
-    </w:tbl>
-    <w:p>
-      <w:pPr>
-        <w:pStyle w:val="Heading3"/>
-      </w:pPr>
-      <w:r>
-        <w:t>4.6.8 Por que la varianza tira tan fuerte hacia SPX</w:t>
-      </w:r>
-    </w:p>
-    <w:p>
-      <w:r>
-        <w:t>Recordar: sigma_CMC = 4.2 * sigma_SPX. La varianza es cuadratica:</w:t>
-      </w:r>
-    </w:p>
-    <w:p>
-      <w:pPr>
-        <w:spacing w:before="80" w:after="80"/>
-        <w:ind w:left="432"/>
-      </w:pPr>
-      <w:r>
-        <w:rPr>
-          <w:rFonts w:ascii="Consolas" w:hAnsi="Consolas"/>
-          <w:sz w:val="18"/>
-        </w:rPr>
-        <w:t>Var(100% CMC) ~ sigma_CMC^2  ~ 0.0096</w:t>
-        <w:br/>
-        <w:t>Var(100% SPX) ~ sigma_SPX^2  ~ 0.0005</w:t>
-        <w:br/>
-        <w:t>Var(50/50)    ~ 0.0027 (con correlacion +0.31)</w:t>
-        <w:br/>
-        <w:br/>
-        <w:t>Ir de 50/50 a 100% CMC -&gt; multiplica la varianza por 3.5x.</w:t>
-        <w:br/>
-        <w:t>El optimizador paga ese costo solo si el gap de retorno es muy a favor de CMC.</w:t>
-      </w:r>
-    </w:p>
-    <w:p>
-      <w:pPr>
-        <w:pStyle w:val="Heading3"/>
-      </w:pPr>
-      <w:r>
-        <w:t>4.6.9 Por que m no cambia composicion pero si dinamica</w:t>
-      </w:r>
-    </w:p>
-    <w:p>
-      <w:r>
-        <w:t>m penaliza c*(u+v) - los costos de transaccion. Como la composicion optima depende del gap (que es casi constante), m no cambia la COMPOSICION media. Pero:</w:t>
-      </w:r>
-    </w:p>
-    <w:p>
-      <w:pPr>
-        <w:pStyle w:val="ListBullet"/>
-      </w:pPr>
-      <w:r>
-        <w:rPr>
-          <w:b/>
-        </w:rPr>
-        <w:t xml:space="preserve">m chico: </w:t>
-      </w:r>
-      <w:r>
-        <w:t>el optimizador rebalancea libremente -&gt; politica sigue oscilaciones de mu_mix(t)</w:t>
-      </w:r>
-    </w:p>
-    <w:p>
-      <w:pPr>
-        <w:pStyle w:val="ListBullet"/>
-      </w:pPr>
-      <w:r>
-        <w:rPr>
-          <w:b/>
-        </w:rPr>
-        <w:t xml:space="preserve">m grande: </w:t>
-      </w:r>
-      <w:r>
-        <w:t>cada rebalanceo cuesta -&gt; politica se queda cerca de la composicion media -&gt; menos turnover</w:t>
-      </w:r>
-    </w:p>
-    <w:p>
-      <w:pPr>
-        <w:pStyle w:val="Heading3"/>
-      </w:pPr>
-      <w:r>
-        <w:t>4.6.10 El bucle de decision en cada semana</w:t>
-      </w:r>
-    </w:p>
-    <w:p>
-      <w:pPr>
-        <w:spacing w:before="80" w:after="80"/>
-        <w:ind w:left="432"/>
-      </w:pPr>
-      <w:r>
-        <w:rPr>
-          <w:rFonts w:ascii="Consolas" w:hAnsi="Consolas"/>
-          <w:sz w:val="18"/>
-        </w:rPr>
-        <w:t>Para cada semana t:</w:t>
-        <w:br/>
-        <w:t xml:space="preserve">  1. LSTM predice p_bull(SPX, t) y p_bull(CMC, t) (cada uno en {0.4, 0.6})</w:t>
-        <w:br/>
-        <w:t xml:space="preserve">  2. mu_mix(SPX, t) = p_bull_SPX*mu_hat(SPX,bull) + p_bear_SPX*mu_hat(SPX,bear)</w:t>
-        <w:br/>
-        <w:t xml:space="preserve">     mu_mix(CMC, t) = p_bull_CMC*mu_hat(CMC,bull) + p_bear_CMC*mu_hat(CMC,bear)</w:t>
-        <w:br/>
-        <w:t xml:space="preserve">  3. gap(t) = mu_mix(SPX, t) - mu_mix(CMC, t)  -&gt; uno de 4 valores discretos</w:t>
-        <w:br/>
-        <w:t xml:space="preserve">  4. Optimizador computa w*(t) sopesando:</w:t>
-        <w:br/>
-        <w:t xml:space="preserve">       retorno = w*mu_mix_SPX + (1-w)*mu_mix_CMC  (favorece CMC si gap&lt;0)</w:t>
-        <w:br/>
-        <w:t xml:space="preserve">       riesgo  = lambda * Var(w)                  (favorece SPX, min-var)</w:t>
-        <w:br/>
-        <w:t xml:space="preserve">       costo   = m * c * |w(t)-w(t-1)|            (favorece w cercano a w(t-1))</w:t>
-        <w:br/>
-        <w:t xml:space="preserve">  5. Resultado:</w:t>
-        <w:br/>
-        <w:t xml:space="preserve">     - Con lambda=0.30: gap negativo gana -&gt; w*(t) ~ 0 (100% CMC)</w:t>
-        <w:br/>
-        <w:t xml:space="preserve">     - Con lambda=1.80: var penalty gana  -&gt; w*(t) ~ 0.75 (75% SPX)</w:t>
-      </w:r>
-    </w:p>
-    <w:p>
-      <w:pPr>
-        <w:pStyle w:val="Heading3"/>
-      </w:pPr>
-      <w:r>
-        <w:t>4.6.11 Por que p_bull casi-binario no salva al modelo</w:t>
-      </w:r>
-    </w:p>
-    <w:p>
-      <w:r>
-        <w:t>Pensemos: si p_bull(SPX) cambiara dramaticamente (de 0 a 1), mu_mix(SPX, t) oscilaria entre mu_hat(SPX, bull) y mu_hat(SPX, bear) - entre +0.175% y +0.205%. Eso es un rango de 0.03%/sem. INSIGNIFICANTE.</w:t>
-      </w:r>
-    </w:p>
-    <w:p>
-      <w:r>
-        <w:rPr>
-          <w:b/>
-        </w:rPr>
-        <w:t>El "rango efectivo" de mu_mix esta limitado por CUAN DISTINTOS sean mu_hat_bull y mu_hat_bear, no por cuanto varie p_bull. Con p_hist los mu_hat apenas se distinguen (excepto para CMC donde tienen gap pero invertido).</w:t>
-      </w:r>
-    </w:p>
-    <w:p>
-      <w:pPr>
-        <w:pStyle w:val="Heading3"/>
-      </w:pPr>
-      <w:r>
-        <w:t>4.6.12 La conclusion estructural</w:t>
-      </w:r>
-    </w:p>
-    <w:p>
-      <w:pPr>
-        <w:ind w:left="576" w:right="576"/>
-      </w:pPr>
-      <w:r>
-        <w:rPr>
-          <w:i/>
-          <w:sz w:val="20"/>
-        </w:rPr>
-        <w:t>El optimizador NO mira directamente mu_hat. Mira mu_mix, que es la combinacion ponderada por las creencias del LSTM. Esto crea una cadena de informacion:</w:t>
-        <w:br/>
-        <w:br/>
-        <w:t>1. mu_hat es lo que el historico te dice sobre cada regimen.</w:t>
-        <w:br/>
-        <w:t>2. p_bull es lo que el LSTM cree sobre el regimen en cada t.</w:t>
-        <w:br/>
-        <w:t>3. mu_mix es la combinacion - "que retorno espero, dado lo que el modelo predice".</w:t>
-        <w:br/>
-        <w:t>4. El optimizador actua sobre esa combinacion, balanceandola contra la varianza.</w:t>
-        <w:br/>
-        <w:br/>
-        <w:t>Si cualquier eslabon esta mal, todo esta mal. En p_hist, el sesgo de mu_hat (siempre favor CMC) DOMINA independientemente de lo que diga el LSTM. Por eso la politica es estatica en 100% CMC.</w:t>
+        <w:t>mu_hat tiene gaps CHICOS (SPX: 0.03%, CMC: -0.58% con bear&gt;bull). mu_mix es casi constante (-0.4%/sem favoreciendo siempre CMC). El optimizador con lambda bajo va 100% CMC estatica. CMC real -13% -&gt; backtest -20%.</w:t>
       </w:r>
     </w:p>
     <w:p>
@@ -4717,1266 +3237,7 @@
         <w:pStyle w:val="Heading1"/>
       </w:pPr>
       <w:r>
-        <w:t>5. Efecto de lambda y m sobre la politica</w:t>
-      </w:r>
-    </w:p>
-    <w:p>
-      <w:pPr>
-        <w:pStyle w:val="Heading2"/>
-      </w:pPr>
-      <w:r>
-        <w:t>5.1 La FO penaliza DOS cosas</w:t>
-      </w:r>
-    </w:p>
-    <w:p>
-      <w:pPr>
-        <w:spacing w:before="80" w:after="80"/>
-        <w:ind w:left="432"/>
-      </w:pPr>
-      <w:r>
-        <w:rPr>
-          <w:rFonts w:ascii="Consolas" w:hAnsi="Consolas"/>
-          <w:sz w:val="18"/>
-        </w:rPr>
-        <w:t>max  z = Sum_t [ Sum_i w_i * mu_mix(i, t)                          &lt;- retorno</w:t>
-        <w:br/>
-        <w:t xml:space="preserve">               - lambda * (Sum_ij w_i * w_j * sigma(i,j,t) - V_max) &lt;- riesgo</w:t>
-        <w:br/>
-        <w:t xml:space="preserve">               - m * Sum_i c_i * (u_i + v_i)                        &lt;- costos]</w:t>
-      </w:r>
-    </w:p>
-    <w:p>
-      <w:pPr>
-        <w:pStyle w:val="Heading2"/>
-      </w:pPr>
-      <w:r>
-        <w:t>5.2 Grilla completa 5x3 de politicas w*(lambda, m)</w:t>
-      </w:r>
-    </w:p>
-    <w:tbl>
-      <w:tblPr>
-        <w:tblStyle w:val="LightGrid-Accent1"/>
-        <w:tblW w:type="auto" w:w="0"/>
-        <w:jc w:val="center"/>
-        <w:tblLook w:firstColumn="1" w:firstRow="1" w:lastColumn="0" w:lastRow="0" w:noHBand="0" w:noVBand="1" w:val="04A0"/>
-      </w:tblPr>
-      <w:tblGrid>
-        <w:gridCol w:w="1987"/>
-        <w:gridCol w:w="1987"/>
-        <w:gridCol w:w="1987"/>
-        <w:gridCol w:w="1987"/>
-        <w:gridCol w:w="1987"/>
-      </w:tblGrid>
-      <w:tr>
-        <w:tc>
-          <w:tcPr>
-            <w:tcW w:type="dxa" w:w="1296"/>
-          </w:tcPr>
-          <w:p>
-            <w:r>
-              <w:rPr>
-                <w:b/>
-                <w:sz w:val="20"/>
-              </w:rPr>
-              <w:t>lambda</w:t>
-            </w:r>
-          </w:p>
-        </w:tc>
-        <w:tc>
-          <w:tcPr>
-            <w:tcW w:type="dxa" w:w="1008"/>
-          </w:tcPr>
-          <w:p>
-            <w:r>
-              <w:rPr>
-                <w:b/>
-                <w:sz w:val="20"/>
-              </w:rPr>
-              <w:t>m</w:t>
-            </w:r>
-          </w:p>
-        </w:tc>
-        <w:tc>
-          <w:tcPr>
-            <w:tcW w:type="dxa" w:w="1728"/>
-          </w:tcPr>
-          <w:p>
-            <w:r>
-              <w:rPr>
-                <w:b/>
-                <w:sz w:val="20"/>
-              </w:rPr>
-              <w:t>w_SPX mean</w:t>
-            </w:r>
-          </w:p>
-        </w:tc>
-        <w:tc>
-          <w:tcPr>
-            <w:tcW w:type="dxa" w:w="1728"/>
-          </w:tcPr>
-          <w:p>
-            <w:r>
-              <w:rPr>
-                <w:b/>
-                <w:sz w:val="20"/>
-              </w:rPr>
-              <w:t>w_SPX std</w:t>
-            </w:r>
-          </w:p>
-        </w:tc>
-        <w:tc>
-          <w:tcPr>
-            <w:tcW w:type="dxa" w:w="2016"/>
-          </w:tcPr>
-          <w:p>
-            <w:r>
-              <w:rPr>
-                <w:b/>
-                <w:sz w:val="20"/>
-              </w:rPr>
-              <w:t>Turnover</w:t>
-            </w:r>
-          </w:p>
-        </w:tc>
-      </w:tr>
-      <w:tr>
-        <w:tc>
-          <w:tcPr>
-            <w:tcW w:type="dxa" w:w="1296"/>
-          </w:tcPr>
-          <w:p>
-            <w:r>
-              <w:rPr>
-                <w:sz w:val="20"/>
-              </w:rPr>
-              <w:t>0.30</w:t>
-            </w:r>
-          </w:p>
-        </w:tc>
-        <w:tc>
-          <w:tcPr>
-            <w:tcW w:type="dxa" w:w="1008"/>
-          </w:tcPr>
-          <w:p>
-            <w:r>
-              <w:rPr>
-                <w:sz w:val="20"/>
-              </w:rPr>
-              <w:t>0.10</w:t>
-            </w:r>
-          </w:p>
-        </w:tc>
-        <w:tc>
-          <w:tcPr>
-            <w:tcW w:type="dxa" w:w="1728"/>
-          </w:tcPr>
-          <w:p>
-            <w:r>
-              <w:rPr>
-                <w:sz w:val="20"/>
-              </w:rPr>
-              <w:t>0.000</w:t>
-            </w:r>
-          </w:p>
-        </w:tc>
-        <w:tc>
-          <w:tcPr>
-            <w:tcW w:type="dxa" w:w="1728"/>
-          </w:tcPr>
-          <w:p>
-            <w:r>
-              <w:rPr>
-                <w:sz w:val="20"/>
-              </w:rPr>
-              <w:t>0.000</w:t>
-            </w:r>
-          </w:p>
-        </w:tc>
-        <w:tc>
-          <w:tcPr>
-            <w:tcW w:type="dxa" w:w="2016"/>
-          </w:tcPr>
-          <w:p>
-            <w:r>
-              <w:rPr>
-                <w:sz w:val="20"/>
-              </w:rPr>
-              <w:t>0.000</w:t>
-            </w:r>
-          </w:p>
-        </w:tc>
-      </w:tr>
-      <w:tr>
-        <w:tc>
-          <w:tcPr>
-            <w:tcW w:type="dxa" w:w="1296"/>
-          </w:tcPr>
-          <w:p>
-            <w:r>
-              <w:rPr>
-                <w:sz w:val="20"/>
-              </w:rPr>
-              <w:t>0.30</w:t>
-            </w:r>
-          </w:p>
-        </w:tc>
-        <w:tc>
-          <w:tcPr>
-            <w:tcW w:type="dxa" w:w="1008"/>
-          </w:tcPr>
-          <w:p>
-            <w:r>
-              <w:rPr>
-                <w:sz w:val="20"/>
-              </w:rPr>
-              <w:t>0.50</w:t>
-            </w:r>
-          </w:p>
-        </w:tc>
-        <w:tc>
-          <w:tcPr>
-            <w:tcW w:type="dxa" w:w="1728"/>
-          </w:tcPr>
-          <w:p>
-            <w:r>
-              <w:rPr>
-                <w:sz w:val="20"/>
-              </w:rPr>
-              <w:t>0.000</w:t>
-            </w:r>
-          </w:p>
-        </w:tc>
-        <w:tc>
-          <w:tcPr>
-            <w:tcW w:type="dxa" w:w="1728"/>
-          </w:tcPr>
-          <w:p>
-            <w:r>
-              <w:rPr>
-                <w:sz w:val="20"/>
-              </w:rPr>
-              <w:t>0.000</w:t>
-            </w:r>
-          </w:p>
-        </w:tc>
-        <w:tc>
-          <w:tcPr>
-            <w:tcW w:type="dxa" w:w="2016"/>
-          </w:tcPr>
-          <w:p>
-            <w:r>
-              <w:rPr>
-                <w:sz w:val="20"/>
-              </w:rPr>
-              <w:t>0.000</w:t>
-            </w:r>
-          </w:p>
-        </w:tc>
-      </w:tr>
-      <w:tr>
-        <w:tc>
-          <w:tcPr>
-            <w:tcW w:type="dxa" w:w="1296"/>
-          </w:tcPr>
-          <w:p>
-            <w:r>
-              <w:rPr>
-                <w:sz w:val="20"/>
-              </w:rPr>
-              <w:t>0.30</w:t>
-            </w:r>
-          </w:p>
-        </w:tc>
-        <w:tc>
-          <w:tcPr>
-            <w:tcW w:type="dxa" w:w="1008"/>
-          </w:tcPr>
-          <w:p>
-            <w:r>
-              <w:rPr>
-                <w:sz w:val="20"/>
-              </w:rPr>
-              <w:t>1.00</w:t>
-            </w:r>
-          </w:p>
-        </w:tc>
-        <w:tc>
-          <w:tcPr>
-            <w:tcW w:type="dxa" w:w="1728"/>
-          </w:tcPr>
-          <w:p>
-            <w:r>
-              <w:rPr>
-                <w:sz w:val="20"/>
-              </w:rPr>
-              <w:t>0.000</w:t>
-            </w:r>
-          </w:p>
-        </w:tc>
-        <w:tc>
-          <w:tcPr>
-            <w:tcW w:type="dxa" w:w="1728"/>
-          </w:tcPr>
-          <w:p>
-            <w:r>
-              <w:rPr>
-                <w:sz w:val="20"/>
-              </w:rPr>
-              <w:t>0.000</w:t>
-            </w:r>
-          </w:p>
-        </w:tc>
-        <w:tc>
-          <w:tcPr>
-            <w:tcW w:type="dxa" w:w="2016"/>
-          </w:tcPr>
-          <w:p>
-            <w:r>
-              <w:rPr>
-                <w:sz w:val="20"/>
-              </w:rPr>
-              <w:t>0.000</w:t>
-            </w:r>
-          </w:p>
-        </w:tc>
-      </w:tr>
-      <w:tr>
-        <w:tc>
-          <w:tcPr>
-            <w:tcW w:type="dxa" w:w="1296"/>
-          </w:tcPr>
-          <w:p>
-            <w:r>
-              <w:rPr>
-                <w:sz w:val="20"/>
-              </w:rPr>
-              <w:t>0.90</w:t>
-            </w:r>
-          </w:p>
-        </w:tc>
-        <w:tc>
-          <w:tcPr>
-            <w:tcW w:type="dxa" w:w="1008"/>
-          </w:tcPr>
-          <w:p>
-            <w:r>
-              <w:rPr>
-                <w:sz w:val="20"/>
-              </w:rPr>
-              <w:t>0.10</w:t>
-            </w:r>
-          </w:p>
-        </w:tc>
-        <w:tc>
-          <w:tcPr>
-            <w:tcW w:type="dxa" w:w="1728"/>
-          </w:tcPr>
-          <w:p>
-            <w:r>
-              <w:rPr>
-                <w:sz w:val="20"/>
-              </w:rPr>
-              <w:t>0.479</w:t>
-            </w:r>
-          </w:p>
-        </w:tc>
-        <w:tc>
-          <w:tcPr>
-            <w:tcW w:type="dxa" w:w="1728"/>
-          </w:tcPr>
-          <w:p>
-            <w:r>
-              <w:rPr>
-                <w:sz w:val="20"/>
-              </w:rPr>
-              <w:t>0.040</w:t>
-            </w:r>
-          </w:p>
-        </w:tc>
-        <w:tc>
-          <w:tcPr>
-            <w:tcW w:type="dxa" w:w="2016"/>
-          </w:tcPr>
-          <w:p>
-            <w:r>
-              <w:rPr>
-                <w:sz w:val="20"/>
-              </w:rPr>
-              <w:t>1.925</w:t>
-            </w:r>
-          </w:p>
-        </w:tc>
-      </w:tr>
-      <w:tr>
-        <w:tc>
-          <w:tcPr>
-            <w:tcW w:type="dxa" w:w="1296"/>
-          </w:tcPr>
-          <w:p>
-            <w:r>
-              <w:rPr>
-                <w:sz w:val="20"/>
-              </w:rPr>
-              <w:t>0.90</w:t>
-            </w:r>
-          </w:p>
-        </w:tc>
-        <w:tc>
-          <w:tcPr>
-            <w:tcW w:type="dxa" w:w="1008"/>
-          </w:tcPr>
-          <w:p>
-            <w:r>
-              <w:rPr>
-                <w:sz w:val="20"/>
-              </w:rPr>
-              <w:t>0.50</w:t>
-            </w:r>
-          </w:p>
-        </w:tc>
-        <w:tc>
-          <w:tcPr>
-            <w:tcW w:type="dxa" w:w="1728"/>
-          </w:tcPr>
-          <w:p>
-            <w:r>
-              <w:rPr>
-                <w:sz w:val="20"/>
-              </w:rPr>
-              <w:t>0.481</w:t>
-            </w:r>
-          </w:p>
-        </w:tc>
-        <w:tc>
-          <w:tcPr>
-            <w:tcW w:type="dxa" w:w="1728"/>
-          </w:tcPr>
-          <w:p>
-            <w:r>
-              <w:rPr>
-                <w:sz w:val="20"/>
-              </w:rPr>
-              <w:t>0.022</w:t>
-            </w:r>
-          </w:p>
-        </w:tc>
-        <w:tc>
-          <w:tcPr>
-            <w:tcW w:type="dxa" w:w="2016"/>
-          </w:tcPr>
-          <w:p>
-            <w:r>
-              <w:rPr>
-                <w:sz w:val="20"/>
-              </w:rPr>
-              <w:t>0.207</w:t>
-            </w:r>
-          </w:p>
-        </w:tc>
-      </w:tr>
-      <w:tr>
-        <w:tc>
-          <w:tcPr>
-            <w:tcW w:type="dxa" w:w="1296"/>
-          </w:tcPr>
-          <w:p>
-            <w:r>
-              <w:rPr>
-                <w:sz w:val="20"/>
-              </w:rPr>
-              <w:t>0.90</w:t>
-            </w:r>
-          </w:p>
-        </w:tc>
-        <w:tc>
-          <w:tcPr>
-            <w:tcW w:type="dxa" w:w="1008"/>
-          </w:tcPr>
-          <w:p>
-            <w:r>
-              <w:rPr>
-                <w:sz w:val="20"/>
-              </w:rPr>
-              <w:t>1.00</w:t>
-            </w:r>
-          </w:p>
-        </w:tc>
-        <w:tc>
-          <w:tcPr>
-            <w:tcW w:type="dxa" w:w="1728"/>
-          </w:tcPr>
-          <w:p>
-            <w:r>
-              <w:rPr>
-                <w:sz w:val="20"/>
-              </w:rPr>
-              <w:t>0.483</w:t>
-            </w:r>
-          </w:p>
-        </w:tc>
-        <w:tc>
-          <w:tcPr>
-            <w:tcW w:type="dxa" w:w="1728"/>
-          </w:tcPr>
-          <w:p>
-            <w:r>
-              <w:rPr>
-                <w:sz w:val="20"/>
-              </w:rPr>
-              <w:t>0.014</w:t>
-            </w:r>
-          </w:p>
-        </w:tc>
-        <w:tc>
-          <w:tcPr>
-            <w:tcW w:type="dxa" w:w="2016"/>
-          </w:tcPr>
-          <w:p>
-            <w:r>
-              <w:rPr>
-                <w:sz w:val="20"/>
-              </w:rPr>
-              <w:t>0.058</w:t>
-            </w:r>
-          </w:p>
-        </w:tc>
-      </w:tr>
-      <w:tr>
-        <w:tc>
-          <w:tcPr>
-            <w:tcW w:type="dxa" w:w="1296"/>
-          </w:tcPr>
-          <w:p>
-            <w:r>
-              <w:rPr>
-                <w:sz w:val="20"/>
-              </w:rPr>
-              <w:t>1.20</w:t>
-            </w:r>
-          </w:p>
-        </w:tc>
-        <w:tc>
-          <w:tcPr>
-            <w:tcW w:type="dxa" w:w="1008"/>
-          </w:tcPr>
-          <w:p>
-            <w:r>
-              <w:rPr>
-                <w:sz w:val="20"/>
-              </w:rPr>
-              <w:t>0.10</w:t>
-            </w:r>
-          </w:p>
-        </w:tc>
-        <w:tc>
-          <w:tcPr>
-            <w:tcW w:type="dxa" w:w="1728"/>
-          </w:tcPr>
-          <w:p>
-            <w:r>
-              <w:rPr>
-                <w:sz w:val="20"/>
-              </w:rPr>
-              <w:t>0.613</w:t>
-            </w:r>
-          </w:p>
-        </w:tc>
-        <w:tc>
-          <w:tcPr>
-            <w:tcW w:type="dxa" w:w="1728"/>
-          </w:tcPr>
-          <w:p>
-            <w:r>
-              <w:rPr>
-                <w:sz w:val="20"/>
-              </w:rPr>
-              <w:t>0.030</w:t>
-            </w:r>
-          </w:p>
-        </w:tc>
-        <w:tc>
-          <w:tcPr>
-            <w:tcW w:type="dxa" w:w="2016"/>
-          </w:tcPr>
-          <w:p>
-            <w:r>
-              <w:rPr>
-                <w:sz w:val="20"/>
-              </w:rPr>
-              <w:t>1.416</w:t>
-            </w:r>
-          </w:p>
-        </w:tc>
-      </w:tr>
-      <w:tr>
-        <w:tc>
-          <w:tcPr>
-            <w:tcW w:type="dxa" w:w="1296"/>
-          </w:tcPr>
-          <w:p>
-            <w:r>
-              <w:rPr>
-                <w:sz w:val="20"/>
-              </w:rPr>
-              <w:t>1.20</w:t>
-            </w:r>
-          </w:p>
-        </w:tc>
-        <w:tc>
-          <w:tcPr>
-            <w:tcW w:type="dxa" w:w="1008"/>
-          </w:tcPr>
-          <w:p>
-            <w:r>
-              <w:rPr>
-                <w:sz w:val="20"/>
-              </w:rPr>
-              <w:t>0.50</w:t>
-            </w:r>
-          </w:p>
-        </w:tc>
-        <w:tc>
-          <w:tcPr>
-            <w:tcW w:type="dxa" w:w="1728"/>
-          </w:tcPr>
-          <w:p>
-            <w:r>
-              <w:rPr>
-                <w:sz w:val="20"/>
-              </w:rPr>
-              <w:t>0.612</w:t>
-            </w:r>
-          </w:p>
-        </w:tc>
-        <w:tc>
-          <w:tcPr>
-            <w:tcW w:type="dxa" w:w="1728"/>
-          </w:tcPr>
-          <w:p>
-            <w:r>
-              <w:rPr>
-                <w:sz w:val="20"/>
-              </w:rPr>
-              <w:t>0.019</w:t>
-            </w:r>
-          </w:p>
-        </w:tc>
-        <w:tc>
-          <w:tcPr>
-            <w:tcW w:type="dxa" w:w="2016"/>
-          </w:tcPr>
-          <w:p>
-            <w:r>
-              <w:rPr>
-                <w:sz w:val="20"/>
-              </w:rPr>
-              <w:t>0.172</w:t>
-            </w:r>
-          </w:p>
-        </w:tc>
-      </w:tr>
-      <w:tr>
-        <w:tc>
-          <w:tcPr>
-            <w:tcW w:type="dxa" w:w="1296"/>
-          </w:tcPr>
-          <w:p>
-            <w:r>
-              <w:rPr>
-                <w:sz w:val="20"/>
-              </w:rPr>
-              <w:t>1.20</w:t>
-            </w:r>
-          </w:p>
-        </w:tc>
-        <w:tc>
-          <w:tcPr>
-            <w:tcW w:type="dxa" w:w="1008"/>
-          </w:tcPr>
-          <w:p>
-            <w:r>
-              <w:rPr>
-                <w:sz w:val="20"/>
-              </w:rPr>
-              <w:t>1.00</w:t>
-            </w:r>
-          </w:p>
-        </w:tc>
-        <w:tc>
-          <w:tcPr>
-            <w:tcW w:type="dxa" w:w="1728"/>
-          </w:tcPr>
-          <w:p>
-            <w:r>
-              <w:rPr>
-                <w:sz w:val="20"/>
-              </w:rPr>
-              <w:t>0.611</w:t>
-            </w:r>
-          </w:p>
-        </w:tc>
-        <w:tc>
-          <w:tcPr>
-            <w:tcW w:type="dxa" w:w="1728"/>
-          </w:tcPr>
-          <w:p>
-            <w:r>
-              <w:rPr>
-                <w:sz w:val="20"/>
-              </w:rPr>
-              <w:t>0.017</w:t>
-            </w:r>
-          </w:p>
-        </w:tc>
-        <w:tc>
-          <w:tcPr>
-            <w:tcW w:type="dxa" w:w="2016"/>
-          </w:tcPr>
-          <w:p>
-            <w:r>
-              <w:rPr>
-                <w:sz w:val="20"/>
-              </w:rPr>
-              <w:t>0.077</w:t>
-            </w:r>
-          </w:p>
-        </w:tc>
-      </w:tr>
-      <w:tr>
-        <w:tc>
-          <w:tcPr>
-            <w:tcW w:type="dxa" w:w="1296"/>
-          </w:tcPr>
-          <w:p>
-            <w:r>
-              <w:rPr>
-                <w:sz w:val="20"/>
-              </w:rPr>
-              <w:t>1.50</w:t>
-            </w:r>
-          </w:p>
-        </w:tc>
-        <w:tc>
-          <w:tcPr>
-            <w:tcW w:type="dxa" w:w="1008"/>
-          </w:tcPr>
-          <w:p>
-            <w:r>
-              <w:rPr>
-                <w:sz w:val="20"/>
-              </w:rPr>
-              <w:t>0.10</w:t>
-            </w:r>
-          </w:p>
-        </w:tc>
-        <w:tc>
-          <w:tcPr>
-            <w:tcW w:type="dxa" w:w="1728"/>
-          </w:tcPr>
-          <w:p>
-            <w:r>
-              <w:rPr>
-                <w:sz w:val="20"/>
-              </w:rPr>
-              <w:t>0.694</w:t>
-            </w:r>
-          </w:p>
-        </w:tc>
-        <w:tc>
-          <w:tcPr>
-            <w:tcW w:type="dxa" w:w="1728"/>
-          </w:tcPr>
-          <w:p>
-            <w:r>
-              <w:rPr>
-                <w:sz w:val="20"/>
-              </w:rPr>
-              <w:t>0.024</w:t>
-            </w:r>
-          </w:p>
-        </w:tc>
-        <w:tc>
-          <w:tcPr>
-            <w:tcW w:type="dxa" w:w="2016"/>
-          </w:tcPr>
-          <w:p>
-            <w:r>
-              <w:rPr>
-                <w:sz w:val="20"/>
-              </w:rPr>
-              <w:t>1.115</w:t>
-            </w:r>
-          </w:p>
-        </w:tc>
-      </w:tr>
-      <w:tr>
-        <w:tc>
-          <w:tcPr>
-            <w:tcW w:type="dxa" w:w="1296"/>
-          </w:tcPr>
-          <w:p>
-            <w:r>
-              <w:rPr>
-                <w:sz w:val="20"/>
-              </w:rPr>
-              <w:t>1.50</w:t>
-            </w:r>
-          </w:p>
-        </w:tc>
-        <w:tc>
-          <w:tcPr>
-            <w:tcW w:type="dxa" w:w="1008"/>
-          </w:tcPr>
-          <w:p>
-            <w:r>
-              <w:rPr>
-                <w:sz w:val="20"/>
-              </w:rPr>
-              <w:t>0.50</w:t>
-            </w:r>
-          </w:p>
-        </w:tc>
-        <w:tc>
-          <w:tcPr>
-            <w:tcW w:type="dxa" w:w="1728"/>
-          </w:tcPr>
-          <w:p>
-            <w:r>
-              <w:rPr>
-                <w:sz w:val="20"/>
-              </w:rPr>
-              <w:t>0.693</w:t>
-            </w:r>
-          </w:p>
-        </w:tc>
-        <w:tc>
-          <w:tcPr>
-            <w:tcW w:type="dxa" w:w="1728"/>
-          </w:tcPr>
-          <w:p>
-            <w:r>
-              <w:rPr>
-                <w:sz w:val="20"/>
-              </w:rPr>
-              <w:t>0.015</w:t>
-            </w:r>
-          </w:p>
-        </w:tc>
-        <w:tc>
-          <w:tcPr>
-            <w:tcW w:type="dxa" w:w="2016"/>
-          </w:tcPr>
-          <w:p>
-            <w:r>
-              <w:rPr>
-                <w:sz w:val="20"/>
-              </w:rPr>
-              <w:t>0.137</w:t>
-            </w:r>
-          </w:p>
-        </w:tc>
-      </w:tr>
-      <w:tr>
-        <w:tc>
-          <w:tcPr>
-            <w:tcW w:type="dxa" w:w="1296"/>
-          </w:tcPr>
-          <w:p>
-            <w:r>
-              <w:rPr>
-                <w:sz w:val="20"/>
-              </w:rPr>
-              <w:t>1.50</w:t>
-            </w:r>
-          </w:p>
-        </w:tc>
-        <w:tc>
-          <w:tcPr>
-            <w:tcW w:type="dxa" w:w="1008"/>
-          </w:tcPr>
-          <w:p>
-            <w:r>
-              <w:rPr>
-                <w:sz w:val="20"/>
-              </w:rPr>
-              <w:t>1.00</w:t>
-            </w:r>
-          </w:p>
-        </w:tc>
-        <w:tc>
-          <w:tcPr>
-            <w:tcW w:type="dxa" w:w="1728"/>
-          </w:tcPr>
-          <w:p>
-            <w:r>
-              <w:rPr>
-                <w:sz w:val="20"/>
-              </w:rPr>
-              <w:t>0.692</w:t>
-            </w:r>
-          </w:p>
-        </w:tc>
-        <w:tc>
-          <w:tcPr>
-            <w:tcW w:type="dxa" w:w="1728"/>
-          </w:tcPr>
-          <w:p>
-            <w:r>
-              <w:rPr>
-                <w:sz w:val="20"/>
-              </w:rPr>
-              <w:t>0.013</w:t>
-            </w:r>
-          </w:p>
-        </w:tc>
-        <w:tc>
-          <w:tcPr>
-            <w:tcW w:type="dxa" w:w="2016"/>
-          </w:tcPr>
-          <w:p>
-            <w:r>
-              <w:rPr>
-                <w:sz w:val="20"/>
-              </w:rPr>
-              <w:t>0.060</w:t>
-            </w:r>
-          </w:p>
-        </w:tc>
-      </w:tr>
-      <w:tr>
-        <w:tc>
-          <w:tcPr>
-            <w:tcW w:type="dxa" w:w="1296"/>
-          </w:tcPr>
-          <w:p>
-            <w:r>
-              <w:rPr>
-                <w:sz w:val="20"/>
-              </w:rPr>
-              <w:t>1.80</w:t>
-            </w:r>
-          </w:p>
-        </w:tc>
-        <w:tc>
-          <w:tcPr>
-            <w:tcW w:type="dxa" w:w="1008"/>
-          </w:tcPr>
-          <w:p>
-            <w:r>
-              <w:rPr>
-                <w:sz w:val="20"/>
-              </w:rPr>
-              <w:t>0.10</w:t>
-            </w:r>
-          </w:p>
-        </w:tc>
-        <w:tc>
-          <w:tcPr>
-            <w:tcW w:type="dxa" w:w="1728"/>
-          </w:tcPr>
-          <w:p>
-            <w:r>
-              <w:rPr>
-                <w:sz w:val="20"/>
-              </w:rPr>
-              <w:t>0.748</w:t>
-            </w:r>
-          </w:p>
-        </w:tc>
-        <w:tc>
-          <w:tcPr>
-            <w:tcW w:type="dxa" w:w="1728"/>
-          </w:tcPr>
-          <w:p>
-            <w:r>
-              <w:rPr>
-                <w:sz w:val="20"/>
-              </w:rPr>
-              <w:t>0.019</w:t>
-            </w:r>
-          </w:p>
-        </w:tc>
-        <w:tc>
-          <w:tcPr>
-            <w:tcW w:type="dxa" w:w="2016"/>
-          </w:tcPr>
-          <w:p>
-            <w:r>
-              <w:rPr>
-                <w:sz w:val="20"/>
-              </w:rPr>
-              <w:t>0.914</w:t>
-            </w:r>
-          </w:p>
-        </w:tc>
-      </w:tr>
-      <w:tr>
-        <w:tc>
-          <w:tcPr>
-            <w:tcW w:type="dxa" w:w="1296"/>
-          </w:tcPr>
-          <w:p>
-            <w:r>
-              <w:rPr>
-                <w:sz w:val="20"/>
-              </w:rPr>
-              <w:t>1.80</w:t>
-            </w:r>
-          </w:p>
-        </w:tc>
-        <w:tc>
-          <w:tcPr>
-            <w:tcW w:type="dxa" w:w="1008"/>
-          </w:tcPr>
-          <w:p>
-            <w:r>
-              <w:rPr>
-                <w:sz w:val="20"/>
-              </w:rPr>
-              <w:t>0.50</w:t>
-            </w:r>
-          </w:p>
-        </w:tc>
-        <w:tc>
-          <w:tcPr>
-            <w:tcW w:type="dxa" w:w="1728"/>
-          </w:tcPr>
-          <w:p>
-            <w:r>
-              <w:rPr>
-                <w:sz w:val="20"/>
-              </w:rPr>
-              <w:t>0.748</w:t>
-            </w:r>
-          </w:p>
-        </w:tc>
-        <w:tc>
-          <w:tcPr>
-            <w:tcW w:type="dxa" w:w="1728"/>
-          </w:tcPr>
-          <w:p>
-            <w:r>
-              <w:rPr>
-                <w:sz w:val="20"/>
-              </w:rPr>
-              <w:t>0.012</w:t>
-            </w:r>
-          </w:p>
-        </w:tc>
-        <w:tc>
-          <w:tcPr>
-            <w:tcW w:type="dxa" w:w="2016"/>
-          </w:tcPr>
-          <w:p>
-            <w:r>
-              <w:rPr>
-                <w:sz w:val="20"/>
-              </w:rPr>
-              <w:t>0.112</w:t>
-            </w:r>
-          </w:p>
-        </w:tc>
-      </w:tr>
-      <w:tr>
-        <w:tc>
-          <w:tcPr>
-            <w:tcW w:type="dxa" w:w="1296"/>
-          </w:tcPr>
-          <w:p>
-            <w:r>
-              <w:rPr>
-                <w:sz w:val="20"/>
-              </w:rPr>
-              <w:t>1.80</w:t>
-            </w:r>
-          </w:p>
-        </w:tc>
-        <w:tc>
-          <w:tcPr>
-            <w:tcW w:type="dxa" w:w="1008"/>
-          </w:tcPr>
-          <w:p>
-            <w:r>
-              <w:rPr>
-                <w:sz w:val="20"/>
-              </w:rPr>
-              <w:t>1.00</w:t>
-            </w:r>
-          </w:p>
-        </w:tc>
-        <w:tc>
-          <w:tcPr>
-            <w:tcW w:type="dxa" w:w="1728"/>
-          </w:tcPr>
-          <w:p>
-            <w:r>
-              <w:rPr>
-                <w:sz w:val="20"/>
-              </w:rPr>
-              <w:t>0.747</w:t>
-            </w:r>
-          </w:p>
-        </w:tc>
-        <w:tc>
-          <w:tcPr>
-            <w:tcW w:type="dxa" w:w="1728"/>
-          </w:tcPr>
-          <w:p>
-            <w:r>
-              <w:rPr>
-                <w:sz w:val="20"/>
-              </w:rPr>
-              <w:t>0.011</w:t>
-            </w:r>
-          </w:p>
-        </w:tc>
-        <w:tc>
-          <w:tcPr>
-            <w:tcW w:type="dxa" w:w="2016"/>
-          </w:tcPr>
-          <w:p>
-            <w:r>
-              <w:rPr>
-                <w:sz w:val="20"/>
-              </w:rPr>
-              <w:t>0.049</w:t>
-            </w:r>
-          </w:p>
-        </w:tc>
-      </w:tr>
-    </w:tbl>
-    <w:p>
-      <w:pPr>
-        <w:pStyle w:val="Heading2"/>
-      </w:pPr>
-      <w:r>
-        <w:t>5.3 Tres patrones</w:t>
-      </w:r>
-    </w:p>
-    <w:p>
-      <w:pPr>
-        <w:pStyle w:val="ListNumber"/>
-      </w:pPr>
-      <w:r>
-        <w:rPr>
-          <w:b/>
-        </w:rPr>
-        <w:t xml:space="preserve">lambda SI funciona: </w:t>
-      </w:r>
-      <w:r>
-        <w:t>w_SPX mean sube de 0% (lambda=0.3) a 75% (lambda=1.8).</w:t>
-      </w:r>
-    </w:p>
-    <w:p>
-      <w:pPr>
-        <w:pStyle w:val="ListNumber"/>
-      </w:pPr>
-      <w:r>
-        <w:rPr>
-          <w:b/>
-        </w:rPr>
-        <w:t xml:space="preserve">m SI funciona: </w:t>
-      </w:r>
-      <w:r>
-        <w:t>para cualquier lambda fijo, turnover cae con m.</w:t>
-      </w:r>
-    </w:p>
-    <w:p>
-      <w:pPr>
-        <w:pStyle w:val="ListNumber"/>
-      </w:pPr>
-      <w:r>
-        <w:rPr>
-          <w:b/>
-        </w:rPr>
-        <w:t xml:space="preserve">Caso degenerado lambda=0.30: </w:t>
-      </w:r>
-      <w:r>
-        <w:t>m no tiene efecto - 100% CMC con cualquier m.</w:t>
-      </w:r>
-    </w:p>
-    <w:p>
-      <w:pPr>
-        <w:pStyle w:val="Heading2"/>
-      </w:pPr>
-      <w:r>
-        <w:t>5.4 Por que regret-grid selecciona lambda=0.30</w:t>
-      </w:r>
-    </w:p>
-    <w:p>
-      <w:r>
-        <w:t>Si lambda=1.80 da politica casi balanceada (75% SPX, parecida a naive), por que el regret-grid no la selecciona?</w:t>
-      </w:r>
-    </w:p>
-    <w:p>
-      <w:r>
-        <w:t>Porque los 5 escenarios sinteticos tienen mean CMC = +122%. Politicas concentradas en CMC ganan en 3 de 5 escenarios. Politicas balanceadas dejan plata sobre la mesa -&gt; regret mas alto. El regret-grid selecciona 100% CMC porque captura mejor el upside CMC.</w:t>
-      </w:r>
-    </w:p>
-    <w:p>
-      <w:pPr>
-        <w:ind w:left="576" w:right="576"/>
-      </w:pPr>
-      <w:r>
-        <w:rPr>
-          <w:i/>
-          <w:sz w:val="20"/>
-        </w:rPr>
-        <w:t>El optimizador NO esta roto. Markowitz funciona perfectamente. El problema esta en el regret-grid, que HEREDA el sesgo CMC de los escenarios sinteticos.</w:t>
-      </w:r>
-    </w:p>
-    <w:p>
-      <w:r>
-        <w:br w:type="page"/>
-      </w:r>
-    </w:p>
-    <w:p>
-      <w:pPr>
-        <w:pStyle w:val="Heading1"/>
-      </w:pPr>
-      <w:r>
-        <w:t>6. Por que pierde plata</w:t>
-      </w:r>
-    </w:p>
-    <w:p>
-      <w:pPr>
-        <w:spacing w:before="80" w:after="80"/>
-        <w:ind w:left="432"/>
-      </w:pPr>
-      <w:r>
-        <w:rPr>
-          <w:rFonts w:ascii="Consolas" w:hAnsi="Consolas"/>
-          <w:sz w:val="18"/>
-        </w:rPr>
-        <w:t>Politica: w_CMC = 1.0 siempre</w:t>
-        <w:br/>
-        <w:t>CMC real cumret: -13.2% sobre 163 semanas</w:t>
-        <w:br/>
-        <w:t>Costo inicial: 0.2%</w:t>
-        <w:br/>
-        <w:t>Resultado: cap_final = $7,938 (-20.6%)</w:t>
-        <w:br/>
-        <w:br/>
-        <w:t>Naive 50/50:</w:t>
-        <w:br/>
-        <w:t xml:space="preserve">  50% CMC -&gt; captura mitad de la caida</w:t>
-        <w:br/>
-        <w:t xml:space="preserve">  50% SPX -&gt; captura +29.8% de SPX</w:t>
-        <w:br/>
-        <w:t xml:space="preserve">  Resultado: cap_final = $12,092 (+20.9%)</w:t>
-      </w:r>
-    </w:p>
-    <w:p>
-      <w:r>
-        <w:br w:type="page"/>
-      </w:r>
-    </w:p>
-    <w:p>
-      <w:pPr>
-        <w:pStyle w:val="Heading1"/>
-      </w:pPr>
-      <w:r>
-        <w:t>7. Comparativa: p_hist vs p_sign</w:t>
+        <w:t>6. Comparativa: p_sign vs p_hist</w:t>
       </w:r>
     </w:p>
     <w:tbl>
@@ -6016,7 +3277,7 @@
                 <w:b/>
                 <w:sz w:val="20"/>
               </w:rPr>
-              <w:t>p_sign (default)</w:t>
+              <w:t>p_sign</w:t>
             </w:r>
           </w:p>
         </w:tc>
@@ -6127,7 +3388,7 @@
               <w:rPr>
                 <w:sz w:val="20"/>
               </w:rPr>
-              <w:t>Politica</w:t>
+              <w:t>Tipo de politica</w:t>
             </w:r>
           </w:p>
         </w:tc>
@@ -6263,7 +3524,7 @@
               <w:rPr>
                 <w:sz w:val="20"/>
               </w:rPr>
-              <w:t>43.6%</w:t>
+              <w:t>43.6% (anti-skill)</w:t>
             </w:r>
           </w:p>
         </w:tc>
@@ -6332,7 +3593,7 @@
               <w:rPr>
                 <w:sz w:val="20"/>
               </w:rPr>
-              <w:t>Backtest</w:t>
+              <w:t>Backtest RG</w:t>
             </w:r>
           </w:p>
         </w:tc>
@@ -6363,67 +3624,143 @@
           </w:p>
         </w:tc>
       </w:tr>
+      <w:tr>
+        <w:tc>
+          <w:tcPr>
+            <w:tcW w:type="dxa" w:w="2592"/>
+          </w:tcPr>
+          <w:p>
+            <w:r>
+              <w:rPr>
+                <w:sz w:val="20"/>
+              </w:rPr>
+              <w:t>OPT base (verdadero)</w:t>
+            </w:r>
+          </w:p>
+        </w:tc>
+        <w:tc>
+          <w:tcPr>
+            <w:tcW w:type="dxa" w:w="2880"/>
+          </w:tcPr>
+          <w:p>
+            <w:r>
+              <w:rPr>
+                <w:sz w:val="20"/>
+              </w:rPr>
+              <w:t>+45.22%</w:t>
+            </w:r>
+          </w:p>
+        </w:tc>
+        <w:tc>
+          <w:tcPr>
+            <w:tcW w:type="dxa" w:w="3456"/>
+          </w:tcPr>
+          <w:p>
+            <w:r>
+              <w:rPr>
+                <w:sz w:val="20"/>
+              </w:rPr>
+              <w:t>+45.22%</w:t>
+            </w:r>
+          </w:p>
+        </w:tc>
+      </w:tr>
+      <w:tr>
+        <w:tc>
+          <w:tcPr>
+            <w:tcW w:type="dxa" w:w="2592"/>
+          </w:tcPr>
+          <w:p>
+            <w:r>
+              <w:rPr>
+                <w:sz w:val="20"/>
+              </w:rPr>
+              <w:t>Naive 50/50 RB</w:t>
+            </w:r>
+          </w:p>
+        </w:tc>
+        <w:tc>
+          <w:tcPr>
+            <w:tcW w:type="dxa" w:w="2880"/>
+          </w:tcPr>
+          <w:p>
+            <w:r>
+              <w:rPr>
+                <w:sz w:val="20"/>
+              </w:rPr>
+              <w:t>+20.92%</w:t>
+            </w:r>
+          </w:p>
+        </w:tc>
+        <w:tc>
+          <w:tcPr>
+            <w:tcW w:type="dxa" w:w="3456"/>
+          </w:tcPr>
+          <w:p>
+            <w:r>
+              <w:rPr>
+                <w:sz w:val="20"/>
+              </w:rPr>
+              <w:t>+20.92%</w:t>
+            </w:r>
+          </w:p>
+        </w:tc>
+      </w:tr>
     </w:tbl>
     <w:p>
       <w:r>
-        <w:br w:type="page"/>
+        <w:rPr>
+          <w:i/>
+        </w:rPr>
+        <w:t>OPT base y Naive son INDEPENDIENTES del setup.</w:t>
       </w:r>
     </w:p>
     <w:p>
       <w:pPr>
-        <w:pStyle w:val="Heading1"/>
+        <w:pStyle w:val="Heading2"/>
       </w:pPr>
       <w:r>
-        <w:t>8. Causa Raiz</w:t>
+        <w:t>6.1 Dos modos de fracasar</w:t>
       </w:r>
     </w:p>
     <w:p>
       <w:pPr>
-        <w:spacing w:before="80" w:after="80"/>
-        <w:ind w:left="432"/>
+        <w:pStyle w:val="ListBullet"/>
       </w:pPr>
       <w:r>
         <w:rPr>
-          <w:rFonts w:ascii="Consolas" w:hAnsi="Consolas"/>
-          <w:sz w:val="18"/>
+          <w:b/>
         </w:rPr>
-        <w:t>LSTM con skill marginal -&gt; p_bull casi-binario, anti-correlacionado con CMC</w:t>
-        <w:br/>
-        <w:t xml:space="preserve">        |</w:t>
-        <w:br/>
-        <w:t xml:space="preserve">        v</w:t>
-        <w:br/>
-        <w:t>p_hist (HMM) -&gt; mu_hat(CMC, bear) &gt; mu_hat(CMC, bull) (inversion)</w:t>
-        <w:br/>
-        <w:t xml:space="preserve">        |</w:t>
-        <w:br/>
-        <w:t xml:space="preserve">        v</w:t>
-        <w:br/>
-        <w:t>mu_mix(CMC) &gt; mu_mix(SPX) SIEMPRE (gap -0.43%)</w:t>
-        <w:br/>
-        <w:t xml:space="preserve">        |</w:t>
-        <w:br/>
-        <w:t xml:space="preserve">        v</w:t>
-        <w:br/>
-        <w:t>Optimizador con lambda=0.30 -&gt; 100% CMC (varianza no compensa)</w:t>
-        <w:br/>
-        <w:t xml:space="preserve">        |</w:t>
-        <w:br/>
-        <w:t xml:space="preserve">        v</w:t>
-        <w:br/>
-        <w:t>EN PARALELO: rollout genera 5 escenarios pro-CMC (mean +122%)</w:t>
-        <w:br/>
-        <w:t xml:space="preserve">        |</w:t>
-        <w:br/>
-        <w:t xml:space="preserve">        v</w:t>
-        <w:br/>
-        <w:t>Regret-grid selecciona 100% CMC porque captura upside CMC</w:t>
-        <w:br/>
-        <w:t xml:space="preserve">        |</w:t>
-        <w:br/>
-        <w:t xml:space="preserve">        v</w:t>
-        <w:br/>
-        <w:t>CMC real -13% -&gt; Backtest -20.62%</w:t>
+        <w:t xml:space="preserve">p_sign: </w:t>
+      </w:r>
+      <w:r>
+        <w:t>"señal agresiva con timing equivocado". Backtest -32% (PEOR).</w:t>
+      </w:r>
+    </w:p>
+    <w:p>
+      <w:pPr>
+        <w:pStyle w:val="ListBullet"/>
+      </w:pPr>
+      <w:r>
+        <w:rPr>
+          <w:b/>
+        </w:rPr>
+        <w:t xml:space="preserve">p_hist: </w:t>
+      </w:r>
+      <w:r>
+        <w:t>"señal plana con apuesta fija equivocada". Backtest -20% (MENOS peor).</w:t>
+      </w:r>
+    </w:p>
+    <w:p>
+      <w:pPr>
+        <w:ind w:left="576" w:right="576"/>
+      </w:pPr>
+      <w:r>
+        <w:rPr>
+          <w:i/>
+          <w:sz w:val="20"/>
+        </w:rPr>
+        <w:t>AMBOS pierden vs naive (+21%) y vs OPT base verdadero (+45%). p_sign amplifica las perdidas con timing equivocado; p_hist al menos no amplifica porque no hace timing.</w:t>
       </w:r>
     </w:p>
     <w:p>
@@ -6436,7 +3773,7 @@
         <w:pStyle w:val="Heading1"/>
       </w:pPr>
       <w:r>
-        <w:t>9. Estructura para la Defensa</w:t>
+        <w:t>7. Estructura para la Defensa</w:t>
       </w:r>
     </w:p>
     <w:p>
@@ -6444,7 +3781,18 @@
         <w:pStyle w:val="Heading2"/>
       </w:pPr>
       <w:r>
-        <w:t>9.1 Las tres frases para memorizar</w:t>
+        <w:t>7.1 Las tres frases para memorizar</w:t>
+      </w:r>
+    </w:p>
+    <w:p>
+      <w:pPr>
+        <w:pStyle w:val="ListNumber"/>
+      </w:pPr>
+      <w:r>
+        <w:rPr>
+          <w:b/>
+        </w:rPr>
+        <w:t>OPT base verdadero (load_market_data, sin LSTM) gana +45% en backtest. La RG con DL pierde -32% (p_sign) o -20% (p_hist) - el DL EMPEORA el resultado.</w:t>
       </w:r>
     </w:p>
     <w:p>
@@ -6466,18 +3814,7 @@
         <w:rPr>
           <w:b/>
         </w:rPr>
-        <w:t>Los 5 escenarios sinteticos tienen sesgo brutal pro-CMC (+122% mean vs -13% real). Esto sesga la seleccion de g* hacia 100% CMC.</w:t>
-      </w:r>
-    </w:p>
-    <w:p>
-      <w:pPr>
-        <w:pStyle w:val="ListNumber"/>
-      </w:pPr>
-      <w:r>
-        <w:rPr>
-          <w:b/>
-        </w:rPr>
-        <w:t>El optimizador SI penaliza varianza con lambda y rebalanceo con m. El problema esta en la SELECCION del regret, no en la FO.</w:t>
+        <w:t>El optimizador SI funciona (lambda y m hacen lo que deben). El problema esta en los inputs (mu_mix) que vienen del LSTM, o en la SELECCION del regret-grid cuando los escenarios estan sesgados.</w:t>
       </w:r>
     </w:p>
     <w:p>
@@ -6485,7 +3822,7 @@
         <w:pStyle w:val="Heading2"/>
       </w:pPr>
       <w:r>
-        <w:t>9.2 Preguntas anticipadas</w:t>
+        <w:t>7.2 Preguntas anticipadas</w:t>
       </w:r>
     </w:p>
     <w:p>
@@ -6493,7 +3830,7 @@
         <w:rPr>
           <w:b/>
         </w:rPr>
-        <w:t>P: "Como se relacionan mu_hat y mu_mix?"</w:t>
+        <w:t>P: "Cual es el verdadero OPT base?"</w:t>
       </w:r>
     </w:p>
     <w:p>
@@ -6505,7 +3842,7 @@
           <w:i/>
           <w:sz w:val="20"/>
         </w:rPr>
-        <w:t>"mu_hat son 4 numeros fijos calculados sobre el historico - el retorno medio por activo y por regimen. mu_mix se construye en cada t como una media ponderada: mu_mix(i,t) = p_bull(i,t)*mu_hat(i,bull) + p_bear(i,t)*mu_hat(i,bear). Las creencias del LSTM (p_bull) determinan los pesos. mu_mix es lo que el optimizador realmente ve para decidir, NO mu_hat directamente. Si mu_hat_bull ~ mu_hat_bear (como en SPX con p_hist), p_bull casi no importa - mu_mix queda casi constante."</w:t>
+        <w:t>"$14,522 (+45.22%). Se calcula con load_market_data - contexto historico puro sin LSTM ni regret-grid. Es el benchmark del PDF: media-varianza estandar con (lambda=1, m=1) sobre datos reales. Es INDEPENDIENTE del setup (p_sign o p_hist) porque no usa el DL en ninguna parte."</w:t>
       </w:r>
     </w:p>
     <w:p>
@@ -6513,7 +3850,7 @@
         <w:rPr>
           <w:b/>
         </w:rPr>
-        <w:t>P: "Por que la politica termina 100% CMC?"</w:t>
+        <w:t>P: "Por que la RG con DL pierde vs OPT base?"</w:t>
       </w:r>
     </w:p>
     <w:p>
@@ -6525,7 +3862,7 @@
           <w:i/>
           <w:sz w:val="20"/>
         </w:rPr>
-        <w:t>"Porque con p_hist, mu_hat(CMC) &gt; mu_hat(SPX) en cualquier mezcla. El gap mu_mix(SPX) - mu_mix(CMC) es siempre negativo (~-0.4%/sem). Con lambda=0.30 (seleccionado por regret), la varianza no compensa ese gap y va 100% CMC. Con lambda alto (1.8) si compensaria - politica seria 75% SPX. Pero regret-grid no la selecciona porque pierde en escenarios pro-CMC."</w:t>
+        <w:t>"Porque OPT base usa mu_hat estimado directamente del historico (con probabilidades historicas), mientras la RG-DL pasa toda la informacion por el LSTM. Como el LSTM tiene skill marginal y aprendio momentum (mientras CMC es mean-reverting), la informacion que llega al optimizador esta CORRUPTA por la prediccion equivocada. OPT base es robusto porque no hace timing."</w:t>
       </w:r>
     </w:p>
     <w:p>
@@ -6533,7 +3870,7 @@
         <w:rPr>
           <w:b/>
         </w:rPr>
-        <w:t>P: "Como se ven los 5 escenarios?"</w:t>
+        <w:t>P: "Entonces el DL no aporta nada?"</w:t>
       </w:r>
     </w:p>
     <w:p>
@@ -6545,7 +3882,7 @@
           <w:i/>
           <w:sz w:val="20"/>
         </w:rPr>
-        <w:t>"5 trayectorias sinteticas de 163 semanas. Cumret terminal CMC: -61.9%, -43.7%, +49.3%, +191.2%, +474.9%. Mean +122%. Realidad CMC: -13%. Sesgo brutal pro-CMC (+135 pp)."</w:t>
+        <w:t>"En esta data especifica, el DL EMPEORA el resultado. El LSTM con 163 semanas no aprende dinamica robusta. Lo demostre con experimento sintetico: cuando la data tiene señal extractable, el framework SI funciona (+103% vs -26% naive). La limitacion es de DATOS, no de diseño."</w:t>
       </w:r>
     </w:p>
     <w:p>
@@ -6553,7 +3890,7 @@
         <w:rPr>
           <w:b/>
         </w:rPr>
-        <w:t>P: "Pero la varianza esta penalizada en la FO. CMC es mucho mas volatil que SPX, eso no deberia empujar hacia SPX?"</w:t>
+        <w:t>P: "Que harias diferente?"</w:t>
       </w:r>
     </w:p>
     <w:p>
@@ -6565,259 +3902,7 @@
           <w:i/>
           <w:sz w:val="20"/>
         </w:rPr>
-        <w:t>"SI lo hace! Con lambda=1.8 la politica es 75% SPX. El problema es que el REGRET-GRID selecciona lambda=0.30 porque esa politica tiene mejor performance promedio sobre los escenarios pro-CMC. El optimizador no esta roto - el regret-grid hereda el sesgo de los escenarios."</w:t>
-      </w:r>
-    </w:p>
-    <w:p>
-      <w:r>
-        <w:br w:type="page"/>
-      </w:r>
-    </w:p>
-    <w:p>
-      <w:pPr>
-        <w:pStyle w:val="Heading1"/>
-      </w:pPr>
-      <w:r>
-        <w:t>10. Archivos y Reproduccion</w:t>
-      </w:r>
-    </w:p>
-    <w:p>
-      <w:pPr>
-        <w:pStyle w:val="ListBullet"/>
-      </w:pPr>
-      <w:r>
-        <w:rPr>
-          <w:b/>
-        </w:rPr>
-        <w:t>regret_grid_results.csv</w:t>
-      </w:r>
-      <w:r>
-        <w:t xml:space="preserve"> - V[g, s] completo</w:t>
-      </w:r>
-    </w:p>
-    <w:p>
-      <w:pPr>
-        <w:pStyle w:val="ListBullet"/>
-      </w:pPr>
-      <w:r>
-        <w:rPr>
-          <w:b/>
-        </w:rPr>
-        <w:t>regret_table.csv</w:t>
-      </w:r>
-      <w:r>
-        <w:t xml:space="preserve"> - R[g, s]</w:t>
-      </w:r>
-    </w:p>
-    <w:p>
-      <w:pPr>
-        <w:pStyle w:val="ListBullet"/>
-      </w:pPr>
-      <w:r>
-        <w:rPr>
-          <w:b/>
-        </w:rPr>
-        <w:t>regret_summary.csv</w:t>
-      </w:r>
-      <w:r>
-        <w:t xml:space="preserve"> - mean_regret y worst_regret por g</w:t>
-      </w:r>
-    </w:p>
-    <w:p>
-      <w:pPr>
-        <w:pStyle w:val="ListBullet"/>
-      </w:pPr>
-      <w:r>
-        <w:rPr>
-          <w:b/>
-        </w:rPr>
-        <w:t>1_mu_mix_phist.png</w:t>
-      </w:r>
-      <w:r>
-        <w:t xml:space="preserve"> - serie temporal mu_mix(t)</w:t>
-      </w:r>
-    </w:p>
-    <w:p>
-      <w:pPr>
-        <w:pStyle w:val="ListBullet"/>
-      </w:pPr>
-      <w:r>
-        <w:rPr>
-          <w:b/>
-        </w:rPr>
-        <w:t>2_politica_w_phist.png</w:t>
-      </w:r>
-      <w:r>
-        <w:t xml:space="preserve"> - politica w(t)</w:t>
-      </w:r>
-    </w:p>
-    <w:p>
-      <w:pPr>
-        <w:pStyle w:val="ListBullet"/>
-      </w:pPr>
-      <w:r>
-        <w:rPr>
-          <w:b/>
-        </w:rPr>
-        <w:t>3_capital_escenarios_phist.png</w:t>
-      </w:r>
-      <w:r>
-        <w:t xml:space="preserve"> - capital por escenario bajo g*</w:t>
-      </w:r>
-    </w:p>
-    <w:p>
-      <w:pPr>
-        <w:pStyle w:val="ListBullet"/>
-      </w:pPr>
-      <w:r>
-        <w:rPr>
-          <w:b/>
-        </w:rPr>
-        <w:t>4_backtest_phist.png</w:t>
-      </w:r>
-      <w:r>
-        <w:t xml:space="preserve"> - evolucion sobre datos historicos</w:t>
-      </w:r>
-    </w:p>
-    <w:p>
-      <w:pPr>
-        <w:pStyle w:val="ListBullet"/>
-      </w:pPr>
-      <w:r>
-        <w:rPr>
-          <w:b/>
-        </w:rPr>
-        <w:t>5_V_heatmap_phist.png</w:t>
-      </w:r>
-      <w:r>
-        <w:t xml:space="preserve"> - heatmap V[g, s]</w:t>
-      </w:r>
-    </w:p>
-    <w:p>
-      <w:pPr>
-        <w:pStyle w:val="ListBullet"/>
-      </w:pPr>
-      <w:r>
-        <w:rPr>
-          <w:b/>
-        </w:rPr>
-        <w:t>6_mu_mix_compare.png</w:t>
-      </w:r>
-      <w:r>
-        <w:t xml:space="preserve"> - comparativa mu_mix p_sign vs p_hist</w:t>
-      </w:r>
-    </w:p>
-    <w:p>
-      <w:pPr>
-        <w:pStyle w:val="ListBullet"/>
-      </w:pPr>
-      <w:r>
-        <w:rPr>
-          <w:b/>
-        </w:rPr>
-        <w:t>7_escenarios_compare.png</w:t>
-      </w:r>
-      <w:r>
-        <w:t xml:space="preserve"> - los 5 escenarios SPX y CMC vs realidad</w:t>
-      </w:r>
-    </w:p>
-    <w:p>
-      <w:pPr>
-        <w:pStyle w:val="ListBullet"/>
-      </w:pPr>
-      <w:r>
-        <w:rPr>
-          <w:b/>
-        </w:rPr>
-        <w:t>8_cmc_escenarios_vs_real.png</w:t>
-      </w:r>
-      <w:r>
-        <w:t xml:space="preserve"> - zoom a CMC</w:t>
-      </w:r>
-    </w:p>
-    <w:p>
-      <w:pPr>
-        <w:pStyle w:val="ListBullet"/>
-      </w:pPr>
-      <w:r>
-        <w:rPr>
-          <w:b/>
-        </w:rPr>
-        <w:t>9_escenarios_scatter.png</w:t>
-      </w:r>
-      <w:r>
-        <w:t xml:space="preserve"> - scatter (cumret SPX, cumret CMC)</w:t>
-      </w:r>
-    </w:p>
-    <w:p>
-      <w:pPr>
-        <w:pStyle w:val="ListBullet"/>
-      </w:pPr>
-      <w:r>
-        <w:rPr>
-          <w:b/>
-        </w:rPr>
-        <w:t>10_pbull_serie.png</w:t>
-      </w:r>
-      <w:r>
-        <w:t xml:space="preserve"> - serie temporal p_bull(t)</w:t>
-      </w:r>
-    </w:p>
-    <w:p>
-      <w:pPr>
-        <w:pStyle w:val="ListBullet"/>
-      </w:pPr>
-      <w:r>
-        <w:rPr>
-          <w:b/>
-        </w:rPr>
-        <w:t>11_pbull_hist.png</w:t>
-      </w:r>
-      <w:r>
-        <w:t xml:space="preserve"> - distribucion de p_bull</w:t>
-      </w:r>
-    </w:p>
-    <w:p>
-      <w:pPr>
-        <w:pStyle w:val="ListBullet"/>
-      </w:pPr>
-      <w:r>
-        <w:rPr>
-          <w:b/>
-        </w:rPr>
-        <w:t>12_pbull_vs_real.png</w:t>
-      </w:r>
-      <w:r>
-        <w:t xml:space="preserve"> - p_bull vs signo real</w:t>
-      </w:r>
-    </w:p>
-    <w:p>
-      <w:r>
-        <w:rPr>
-          <w:b/>
-        </w:rPr>
-        <w:t>Para reproducir:</w:t>
-      </w:r>
-    </w:p>
-    <w:p>
-      <w:pPr>
-        <w:spacing w:before="80" w:after="80"/>
-        <w:ind w:left="432"/>
-      </w:pPr>
-      <w:r>
-        <w:rPr>
-          <w:rFonts w:ascii="Consolas" w:hAnsi="Consolas"/>
-          <w:sz w:val="18"/>
-        </w:rPr>
-        <w:t>from Regret_Grid import build_dl_context</w:t>
-        <w:br/>
-        <w:t>ctx = build_dl_context(</w:t>
-        <w:br/>
-        <w:t xml:space="preserve">    data_dir="data", checkpoint_path="models/decile_predictor.pt",</w:t>
-        <w:br/>
-        <w:t xml:space="preserve">    T=163, p_method="walking", mu_hat_source="p_hist"</w:t>
-        <w:br/>
-        <w:t>)</w:t>
+        <w:t>"Cuatro extensiones: (1) mas datos (al menos 1000 ventanas), (2) frecuencia diaria, (3) features adicionales (volatilidad, volumen, macro), (4) entrenar LSTM con metrica downstream (regret directo) en vez de pinball loss."</w:t>
       </w:r>
     </w:p>
     <w:sectPr>

</xml_diff>